<commit_message>
update: sync test plan docx with LLM-as-a-judge scoring method and chat log
Made-with: Cursor
</commit_message>
<xml_diff>
--- a/test_plan/经分智能体测试方案2.0.docx
+++ b/test_plan/经分智能体测试方案2.0.docx
@@ -2151,6 +2151,130 @@
         <w:ind w:left="0"/>
         <w:jc w:val="left"/>
       </w:pPr>
+    </w:p>
+    <w:p>
+      <w:r>
+        <w:br w:type="page"/>
+      </w:r>
+    </w:p>
+    <w:p>
+      <w:r>
+        <w:rPr>
+          <w:b/>
+          <w:sz w:val="32"/>
+        </w:rPr>
+        <w:t>附录：开放问题评估与打分标准（LLM-as-a-Judge 自动化打分法）</w:t>
+      </w:r>
+    </w:p>
+    <w:p>
+      <w:r>
+        <w:t xml:space="preserve">鉴于大模型（智能体）的输出为自由文本，且通常不会严格按照设定的“三段式”固定格式输出。为保证评分的客观性、一致性与高效性，测试方案引入 </w:t>
+      </w:r>
+      <w:r>
+        <w:rPr>
+          <w:b/>
+        </w:rPr>
+        <w:t>LLM-as-a-Judge（用大模型当裁判）</w:t>
+      </w:r>
+      <w:r>
+        <w:t xml:space="preserve"> 的自动化评分机制。</w:t>
+      </w:r>
+    </w:p>
+    <w:p>
+      <w:r>
+        <w:rPr>
+          <w:b/>
+          <w:sz w:val="28"/>
+        </w:rPr>
+        <w:t>1. 核心评估理念</w:t>
+      </w:r>
+    </w:p>
+    <w:p>
+      <w:r>
+        <w:t>评分时忽略智能体回答的排版格式（如是否带小标题），纯看其生成的语义是否涵盖了基准答案中的三大核心考核点：</w:t>
+        <w:br/>
+        <w:t>• 事实与数据层：是否找对底层数据，有无幻觉。</w:t>
+        <w:br/>
+        <w:t>• 归纳与分析层：是否把数据转化为业务洞察。</w:t>
+        <w:br/>
+        <w:t>• 落地与建议层：是否给出可执行的管理建议。</w:t>
+      </w:r>
+    </w:p>
+    <w:p>
+      <w:r>
+        <w:rPr>
+          <w:b/>
+          <w:sz w:val="28"/>
+        </w:rPr>
+        <w:t>2. LLM 裁判指令 (Prompt) 模板</w:t>
+      </w:r>
+    </w:p>
+    <w:p>
+      <w:r>
+        <w:rPr>
+          <w:rFonts w:ascii="Courier New" w:hAnsi="Courier New"/>
+          <w:sz w:val="20"/>
+        </w:rPr>
+        <w:t>【系统设定】</w:t>
+        <w:br/>
+        <w:t>你是一个资深的企业经营分析总监，现在你需要给实习生（经分智能体）生成的业务分析报告打分。</w:t>
+        <w:br/>
+        <w:br/>
+        <w:t>【输入信息】</w:t>
+        <w:br/>
+        <w:t>1. 用户提问：[测试用例中的开放问题]</w:t>
+        <w:br/>
+        <w:t>2. 参考基准答案：[测试方案中提供的带数据和建议的三段式标准答案]</w:t>
+        <w:br/>
+        <w:t>3. 智能体实际回答：[被测经分智能体生成的实际长文本]</w:t>
+        <w:br/>
+        <w:br/>
+        <w:t>【打分规则（满分 5 分）】</w:t>
+        <w:br/>
+        <w:t>请忽略智能体回答的排版格式，纯看语义是否涵盖了基准答案的核心考点：</w:t>
+        <w:br/>
+        <w:t>- 准确性（2分）：实际回答中引用的业务数据、数值和客户名称，是否与基准答案一致，有无编造（幻觉）？</w:t>
+        <w:br/>
+        <w:t>- 洞察力（1.5分）：实际回答是否指出了基准答案中提到的业务痛点或现象根因？</w:t>
+        <w:br/>
+        <w:t>- 建议有效性（1.5分）：实际回答是否给出了与基准答案方向一致或同样具有业务指导意义的管理建议？</w:t>
+        <w:br/>
+        <w:br/>
+        <w:t>【输出格式】</w:t>
+        <w:br/>
+        <w:t>1. 得分：[X / 5分]</w:t>
+        <w:br/>
+        <w:t>2. 扣分理由：（如果满分则填“涵盖全面，数据精准”）</w:t>
+      </w:r>
+    </w:p>
+    <w:p>
+      <w:r>
+        <w:rPr>
+          <w:b/>
+          <w:sz w:val="28"/>
+        </w:rPr>
+        <w:t>3. 自动化测试实施路径</w:t>
+      </w:r>
+    </w:p>
+    <w:p>
+      <w:r>
+        <w:t>步骤一：通过 RPA 脚本或 API 批量拉取智能体对 80 道开放题的实际回答，并落盘至 result.xlsx 的“智能体回复”列。</w:t>
+      </w:r>
+    </w:p>
+    <w:p>
+      <w:r>
+        <w:t>步骤二：编写评测脚本，循环读取“问题 + 标准答案 + 智能体回复”，将其拼接到上述 Prompt 模板中。</w:t>
+      </w:r>
+    </w:p>
+    <w:p>
+      <w:r>
+        <w:t>步骤三：调用更高阶的大模型（如 GPT-4o 或 Claude 3.5 Sonnet）接口，让其以裁判身份输出分数与扣分理由。</w:t>
+      </w:r>
+    </w:p>
+    <w:p>
+      <w:r>
+        <w:t>步骤四：汇总分数，计算整体平均分以及“准确性、洞察力、建议”等细分维度的达标率。</w:t>
+      </w:r>
     </w:p>
     <w:sectPr>
       <w:footerReference w:type="default" r:id="rId3"/>

</xml_diff>

<commit_message>
update: move LLM-as-a-judge scoring method to main body of test plan docx
Made-with: Cursor
</commit_message>
<xml_diff>
--- a/test_plan/经分智能体测试方案2.0.docx
+++ b/test_plan/经分智能体测试方案2.0.docx
@@ -1567,626 +1567,25 @@
       </w:tr>
     </w:tbl>
     <w:p>
-      <w:pPr>
-        <w:pStyle w:val="4"/>
-        <w:spacing w:before="260" w:after="120" w:line="288" w:lineRule="auto"/>
-        <w:ind w:left="0"/>
-        <w:jc w:val="left"/>
-        <w:outlineLvl w:val="3"/>
-      </w:pPr>
-      <w:bookmarkStart w:name="heading_4" w:id="4"/>
-      <w:r>
-        <w:rPr>
-          <w:rFonts w:eastAsia="等线" w:ascii="Arial" w:cs="Arial" w:hAnsi="Arial"/>
-          <w:b w:val="true"/>
-          <w:sz w:val="28"/>
-        </w:rPr>
-        <w:t>四. 测试指标</w:t>
-      </w:r>
-      <w:bookmarkEnd w:id="4"/>
-    </w:p>
-    <w:tbl>
-      <w:tblPr>
-        <w:tblW w:w="0" w:type="auto"/>
-        <w:tblInd w:w="0" w:type="dxa"/>
-        <w:tblBorders>
-          <w:top w:val="single" w:color="dee0e3"/>
-          <w:left w:val="single" w:color="dee0e3"/>
-          <w:bottom w:val="single" w:color="dee0e3"/>
-          <w:right w:val="single" w:color="dee0e3"/>
-          <w:insideH w:val="single" w:color="dee0e3"/>
-          <w:insideV w:val="single" w:color="dee0e3"/>
-        </w:tblBorders>
-        <w:tblLayout w:type="fixed"/>
-      </w:tblPr>
-      <w:tblGrid>
-        <w:gridCol w:w="1560"/>
-        <w:gridCol w:w="1680"/>
-        <w:gridCol w:w="1680"/>
-        <w:gridCol w:w="1680"/>
-        <w:gridCol w:w="1680"/>
-      </w:tblGrid>
-      <w:tr>
-        <w:tc>
-          <w:tcPr>
-            <w:tcW w:w="1560" w:type="dxa"/>
-            <w:tcMar>
-              <w:top w:type="dxa" w:w="60"/>
-              <w:left w:type="dxa" w:w="120"/>
-              <w:bottom w:type="dxa" w:w="30"/>
-              <w:right w:type="dxa" w:w="120"/>
-            </w:tcMar>
-          </w:tcPr>
-          <w:p>
-            <w:pPr>
-              <w:spacing w:before="120" w:after="120" w:line="288" w:lineRule="auto"/>
-              <w:ind w:left="0"/>
-              <w:jc w:val="left"/>
-            </w:pPr>
-            <w:r>
-              <w:rPr>
-                <w:rFonts w:eastAsia="等线" w:ascii="Arial" w:cs="Arial" w:hAnsi="Arial"/>
-                <w:sz w:val="22"/>
-              </w:rPr>
-              <w:t>指标名称</w:t>
-            </w:r>
-          </w:p>
-        </w:tc>
-        <w:tc>
-          <w:tcPr>
-            <w:tcW w:w="1680" w:type="dxa"/>
-            <w:tcMar>
-              <w:top w:type="dxa" w:w="60"/>
-              <w:left w:type="dxa" w:w="120"/>
-              <w:bottom w:type="dxa" w:w="30"/>
-              <w:right w:type="dxa" w:w="120"/>
-            </w:tcMar>
-          </w:tcPr>
-          <w:p>
-            <w:pPr>
-              <w:spacing w:before="120" w:after="120" w:line="288" w:lineRule="auto"/>
-              <w:ind w:left="0"/>
-              <w:jc w:val="left"/>
-            </w:pPr>
-            <w:r>
-              <w:rPr>
-                <w:rFonts w:eastAsia="等线" w:ascii="Arial" w:cs="Arial" w:hAnsi="Arial"/>
-                <w:sz w:val="22"/>
-              </w:rPr>
-              <w:t>定义</w:t>
-            </w:r>
-          </w:p>
-        </w:tc>
-        <w:tc>
-          <w:tcPr>
-            <w:tcW w:w="1680" w:type="dxa"/>
-            <w:tcMar>
-              <w:top w:type="dxa" w:w="60"/>
-              <w:left w:type="dxa" w:w="120"/>
-              <w:bottom w:type="dxa" w:w="30"/>
-              <w:right w:type="dxa" w:w="120"/>
-            </w:tcMar>
-          </w:tcPr>
-          <w:p>
-            <w:pPr>
-              <w:spacing w:before="120" w:after="120" w:line="288" w:lineRule="auto"/>
-              <w:ind w:left="0"/>
-              <w:jc w:val="left"/>
-            </w:pPr>
-            <w:r>
-              <w:rPr>
-                <w:rFonts w:eastAsia="等线" w:ascii="Arial" w:cs="Arial" w:hAnsi="Arial"/>
-                <w:sz w:val="22"/>
-              </w:rPr>
-              <w:t>计算方式</w:t>
-            </w:r>
-          </w:p>
-        </w:tc>
-        <w:tc>
-          <w:tcPr>
-            <w:tcW w:w="1680" w:type="dxa"/>
-            <w:tcMar>
-              <w:top w:type="dxa" w:w="60"/>
-              <w:left w:type="dxa" w:w="120"/>
-              <w:bottom w:type="dxa" w:w="30"/>
-              <w:right w:type="dxa" w:w="120"/>
-            </w:tcMar>
-          </w:tcPr>
-          <w:p>
-            <w:pPr>
-              <w:spacing w:before="120" w:after="120" w:line="288" w:lineRule="auto"/>
-              <w:ind w:left="0"/>
-              <w:jc w:val="left"/>
-            </w:pPr>
-            <w:r>
-              <w:rPr>
-                <w:rFonts w:eastAsia="等线" w:ascii="Arial" w:cs="Arial" w:hAnsi="Arial"/>
-                <w:sz w:val="22"/>
-              </w:rPr>
-              <w:t>目标阈值</w:t>
-            </w:r>
-          </w:p>
-        </w:tc>
-        <w:tc>
-          <w:tcPr>
-            <w:tcW w:w="1680" w:type="dxa"/>
-            <w:tcMar>
-              <w:top w:type="dxa" w:w="60"/>
-              <w:left w:type="dxa" w:w="120"/>
-              <w:bottom w:type="dxa" w:w="30"/>
-              <w:right w:type="dxa" w:w="120"/>
-            </w:tcMar>
-          </w:tcPr>
-          <w:p>
-            <w:pPr>
-              <w:spacing w:before="120" w:after="120" w:line="288" w:lineRule="auto"/>
-              <w:ind w:left="0"/>
-              <w:jc w:val="left"/>
-            </w:pPr>
-            <w:r>
-              <w:rPr>
-                <w:rFonts w:eastAsia="等线" w:ascii="Arial" w:cs="Arial" w:hAnsi="Arial"/>
-                <w:sz w:val="22"/>
-              </w:rPr>
-              <w:t>适用问题类型</w:t>
-            </w:r>
-          </w:p>
-        </w:tc>
-      </w:tr>
-      <w:tr>
-        <w:tc>
-          <w:tcPr>
-            <w:tcW w:w="1560" w:type="dxa"/>
-            <w:tcMar>
-              <w:top w:type="dxa" w:w="60"/>
-              <w:left w:type="dxa" w:w="120"/>
-              <w:bottom w:type="dxa" w:w="30"/>
-              <w:right w:type="dxa" w:w="120"/>
-            </w:tcMar>
-          </w:tcPr>
-          <w:p>
-            <w:pPr>
-              <w:spacing w:before="120" w:after="120" w:line="288" w:lineRule="auto"/>
-              <w:ind w:left="0"/>
-              <w:jc w:val="left"/>
-            </w:pPr>
-            <w:r>
-              <w:rPr>
-                <w:rFonts w:eastAsia="等线" w:ascii="Arial" w:cs="Arial" w:hAnsi="Arial"/>
-                <w:sz w:val="22"/>
-              </w:rPr>
-              <w:t>准确性</w:t>
-            </w:r>
-          </w:p>
-        </w:tc>
-        <w:tc>
-          <w:tcPr>
-            <w:tcW w:w="1680" w:type="dxa"/>
-            <w:tcMar>
-              <w:top w:type="dxa" w:w="60"/>
-              <w:left w:type="dxa" w:w="120"/>
-              <w:bottom w:type="dxa" w:w="30"/>
-              <w:right w:type="dxa" w:w="120"/>
-            </w:tcMar>
-          </w:tcPr>
-          <w:p>
-            <w:pPr>
-              <w:spacing w:before="120" w:after="120" w:line="288" w:lineRule="auto"/>
-              <w:ind w:left="0"/>
-              <w:jc w:val="left"/>
-            </w:pPr>
-            <w:r>
-              <w:rPr>
-                <w:rFonts w:eastAsia="等线" w:ascii="Arial" w:cs="Arial" w:hAnsi="Arial"/>
-                <w:sz w:val="22"/>
-              </w:rPr>
-              <w:t>回复的对不对</w:t>
-            </w:r>
-          </w:p>
-        </w:tc>
-        <w:tc>
-          <w:tcPr>
-            <w:tcW w:w="1680" w:type="dxa"/>
-            <w:tcMar>
-              <w:top w:type="dxa" w:w="60"/>
-              <w:left w:type="dxa" w:w="120"/>
-              <w:bottom w:type="dxa" w:w="30"/>
-              <w:right w:type="dxa" w:w="120"/>
-            </w:tcMar>
-          </w:tcPr>
-          <w:p>
-            <w:pPr>
-              <w:spacing w:before="120" w:after="120" w:line="288" w:lineRule="auto"/>
-              <w:ind w:left="0"/>
-              <w:jc w:val="left"/>
-            </w:pPr>
-            <w:r>
-              <w:rPr>
-                <w:rFonts w:eastAsia="等线" w:ascii="Arial" w:cs="Arial" w:hAnsi="Arial"/>
-                <w:sz w:val="22"/>
-              </w:rPr>
-              <w:t>每条问题1-5分专家平均分</w:t>
-            </w:r>
-          </w:p>
-        </w:tc>
-        <w:tc>
-          <w:tcPr>
-            <w:tcW w:w="1680" w:type="dxa"/>
-            <w:tcMar>
-              <w:top w:type="dxa" w:w="60"/>
-              <w:left w:type="dxa" w:w="120"/>
-              <w:bottom w:type="dxa" w:w="30"/>
-              <w:right w:type="dxa" w:w="120"/>
-            </w:tcMar>
-          </w:tcPr>
-          <w:p>
-            <w:pPr>
-              <w:spacing w:before="120" w:after="120" w:line="288" w:lineRule="auto"/>
-              <w:ind w:left="0"/>
-              <w:jc w:val="left"/>
-            </w:pPr>
-            <w:r>
-              <w:rPr>
-                <w:rFonts w:eastAsia="等线" w:ascii="Arial" w:cs="Arial" w:hAnsi="Arial"/>
-                <w:sz w:val="22"/>
-                <w:shd w:fill="f76964"/>
-              </w:rPr>
-              <w:t>平均≥4.5分</w:t>
-            </w:r>
-          </w:p>
-        </w:tc>
-        <w:tc>
-          <w:tcPr>
-            <w:tcW w:w="1680" w:type="dxa"/>
-            <w:tcMar>
-              <w:top w:type="dxa" w:w="60"/>
-              <w:left w:type="dxa" w:w="120"/>
-              <w:bottom w:type="dxa" w:w="30"/>
-              <w:right w:type="dxa" w:w="120"/>
-            </w:tcMar>
-          </w:tcPr>
-          <w:p>
-            <w:pPr>
-              <w:spacing w:before="120" w:after="120" w:line="288" w:lineRule="auto"/>
-              <w:ind w:left="0"/>
-              <w:jc w:val="left"/>
-            </w:pPr>
-            <w:r>
-              <w:rPr>
-                <w:rFonts w:eastAsia="等线" w:ascii="Arial" w:cs="Arial" w:hAnsi="Arial"/>
-                <w:sz w:val="22"/>
-              </w:rPr>
-              <w:t>开放 + 非开放</w:t>
-            </w:r>
-          </w:p>
-        </w:tc>
-      </w:tr>
-      <w:tr>
-        <w:tc>
-          <w:tcPr>
-            <w:tcW w:w="1560" w:type="dxa"/>
-            <w:tcMar>
-              <w:top w:type="dxa" w:w="60"/>
-              <w:left w:type="dxa" w:w="120"/>
-              <w:bottom w:type="dxa" w:w="30"/>
-              <w:right w:type="dxa" w:w="120"/>
-            </w:tcMar>
-          </w:tcPr>
-          <w:p>
-            <w:pPr>
-              <w:spacing w:before="120" w:after="120" w:line="288" w:lineRule="auto"/>
-              <w:ind w:left="0"/>
-              <w:jc w:val="left"/>
-            </w:pPr>
-            <w:r>
-              <w:rPr>
-                <w:rFonts w:eastAsia="等线" w:ascii="Arial" w:cs="Arial" w:hAnsi="Arial"/>
-                <w:sz w:val="22"/>
-              </w:rPr>
-              <w:t>一致性</w:t>
-            </w:r>
-          </w:p>
-        </w:tc>
-        <w:tc>
-          <w:tcPr>
-            <w:tcW w:w="1680" w:type="dxa"/>
-            <w:tcMar>
-              <w:top w:type="dxa" w:w="60"/>
-              <w:left w:type="dxa" w:w="120"/>
-              <w:bottom w:type="dxa" w:w="30"/>
-              <w:right w:type="dxa" w:w="120"/>
-            </w:tcMar>
-          </w:tcPr>
-          <w:p>
-            <w:pPr>
-              <w:spacing w:before="120" w:after="120" w:line="288" w:lineRule="auto"/>
-              <w:ind w:left="0"/>
-              <w:jc w:val="left"/>
-            </w:pPr>
-            <w:r>
-              <w:rPr>
-                <w:rFonts w:eastAsia="等线" w:ascii="Arial" w:cs="Arial" w:hAnsi="Arial"/>
-                <w:sz w:val="22"/>
-              </w:rPr>
-              <w:t>相同问题多次运行输出相同</w:t>
-            </w:r>
-          </w:p>
-        </w:tc>
-        <w:tc>
-          <w:tcPr>
-            <w:tcW w:w="1680" w:type="dxa"/>
-            <w:tcMar>
-              <w:top w:type="dxa" w:w="60"/>
-              <w:left w:type="dxa" w:w="120"/>
-              <w:bottom w:type="dxa" w:w="30"/>
-              <w:right w:type="dxa" w:w="120"/>
-            </w:tcMar>
-          </w:tcPr>
-          <w:p>
-            <w:pPr>
-              <w:spacing w:before="120" w:after="120" w:line="288" w:lineRule="auto"/>
-              <w:ind w:left="0"/>
-              <w:jc w:val="left"/>
-            </w:pPr>
-            <w:r>
-              <w:rPr>
-                <w:rFonts w:eastAsia="等线" w:ascii="Arial" w:cs="Arial" w:hAnsi="Arial"/>
-                <w:sz w:val="22"/>
-              </w:rPr>
-              <w:t>20次运行零差异率</w:t>
-            </w:r>
-          </w:p>
-        </w:tc>
-        <w:tc>
-          <w:tcPr>
-            <w:tcW w:w="1680" w:type="dxa"/>
-            <w:tcMar>
-              <w:top w:type="dxa" w:w="60"/>
-              <w:left w:type="dxa" w:w="120"/>
-              <w:bottom w:type="dxa" w:w="30"/>
-              <w:right w:type="dxa" w:w="120"/>
-            </w:tcMar>
-          </w:tcPr>
-          <w:p>
-            <w:pPr>
-              <w:spacing w:before="120" w:after="120" w:line="288" w:lineRule="auto"/>
-              <w:ind w:left="0"/>
-              <w:jc w:val="left"/>
-            </w:pPr>
-            <w:r>
-              <w:rPr>
-                <w:rFonts w:eastAsia="等线" w:ascii="Arial" w:cs="Arial" w:hAnsi="Arial"/>
-                <w:sz w:val="22"/>
-                <w:shd w:fill="f76964"/>
-              </w:rPr>
-              <w:t>100%</w:t>
-            </w:r>
-          </w:p>
-        </w:tc>
-        <w:tc>
-          <w:tcPr>
-            <w:tcW w:w="1680" w:type="dxa"/>
-            <w:tcMar>
-              <w:top w:type="dxa" w:w="60"/>
-              <w:left w:type="dxa" w:w="120"/>
-              <w:bottom w:type="dxa" w:w="30"/>
-              <w:right w:type="dxa" w:w="120"/>
-            </w:tcMar>
-          </w:tcPr>
-          <w:p>
-            <w:pPr>
-              <w:spacing w:before="120" w:after="120" w:line="288" w:lineRule="auto"/>
-              <w:ind w:left="0"/>
-              <w:jc w:val="left"/>
-            </w:pPr>
-            <w:r>
-              <w:rPr>
-                <w:rFonts w:eastAsia="等线" w:ascii="Arial" w:cs="Arial" w:hAnsi="Arial"/>
-                <w:sz w:val="22"/>
-              </w:rPr>
-              <w:t>两者均适用</w:t>
-            </w:r>
-          </w:p>
-        </w:tc>
-      </w:tr>
-    </w:tbl>
-    <w:p>
-      <w:pPr>
-        <w:numPr>
-          <w:numId w:val="18"/>
-        </w:numPr>
-        <w:spacing w:before="120" w:after="120" w:line="288" w:lineRule="auto"/>
-        <w:ind w:left="0"/>
-        <w:jc w:val="left"/>
-      </w:pPr>
-      <w:r>
-        <w:rPr>
-          <w:rFonts w:eastAsia="等线" w:ascii="Arial" w:cs="Arial" w:hAnsi="Arial"/>
-          <w:b w:val="true"/>
-          <w:sz w:val="22"/>
-        </w:rPr>
-        <w:t>综合通过</w:t>
-      </w:r>
-      <w:r>
-        <w:rPr>
-          <w:rFonts w:eastAsia="等线" w:ascii="Arial" w:cs="Arial" w:hAnsi="Arial"/>
-          <w:sz w:val="22"/>
-        </w:rPr>
-        <w:t>：准确性≥4.5分 + 一致性100% 。</w:t>
-      </w:r>
-    </w:p>
-    <w:p>
-      <w:pPr>
-        <w:pStyle w:val="4"/>
-        <w:spacing w:before="260" w:after="120" w:line="288" w:lineRule="auto"/>
-        <w:ind w:left="0"/>
-        <w:jc w:val="left"/>
-        <w:outlineLvl w:val="3"/>
-      </w:pPr>
-      <w:bookmarkStart w:name="heading_5" w:id="5"/>
-      <w:r>
-        <w:rPr>
-          <w:rFonts w:eastAsia="等线" w:ascii="Arial" w:cs="Arial" w:hAnsi="Arial"/>
-          <w:b w:val="true"/>
-          <w:sz w:val="28"/>
-        </w:rPr>
-        <w:t>五. 测试执行流程</w:t>
-      </w:r>
-      <w:bookmarkEnd w:id="5"/>
-    </w:p>
-    <w:p>
-      <w:pPr>
-        <w:numPr>
-          <w:numId w:val="19"/>
-        </w:numPr>
-        <w:spacing w:before="120" w:after="120" w:line="288" w:lineRule="auto"/>
-        <w:ind w:left="0"/>
-        <w:jc w:val="left"/>
-      </w:pPr>
-      <w:r>
-        <w:rPr>
-          <w:rFonts w:eastAsia="等线" w:ascii="Arial" w:cs="Arial" w:hAnsi="Arial"/>
-          <w:b w:val="true"/>
-          <w:sz w:val="22"/>
-        </w:rPr>
-        <w:t>问题集构造</w:t>
-      </w:r>
-      <w:r>
-        <w:rPr>
-          <w:rFonts w:eastAsia="等线" w:ascii="Arial" w:cs="Arial" w:hAnsi="Arial"/>
-          <w:sz w:val="22"/>
-        </w:rPr>
-        <w:t>：构造80-100个问题（覆盖业务全链，包括非开放和开放问题），确保问题多样性（简单事实查询到深度分析 + 建议），并预定义每个问题的Ground Truth或参考框架。</w:t>
-      </w:r>
-    </w:p>
-    <w:p>
-      <w:pPr>
-        <w:numPr>
-          <w:numId w:val="20"/>
-        </w:numPr>
-        <w:spacing w:before="120" w:after="120" w:line="288" w:lineRule="auto"/>
-        <w:ind w:left="0"/>
-        <w:jc w:val="left"/>
-      </w:pPr>
-      <w:r>
-        <w:rPr>
-          <w:rFonts w:eastAsia="等线" w:ascii="Arial" w:cs="Arial" w:hAnsi="Arial"/>
-          <w:b w:val="true"/>
-          <w:sz w:val="22"/>
-        </w:rPr>
-        <w:t>测试运行</w:t>
-      </w:r>
-      <w:r>
-        <w:rPr>
-          <w:rFonts w:eastAsia="等线" w:ascii="Arial" w:cs="Arial" w:hAnsi="Arial"/>
-          <w:sz w:val="22"/>
-        </w:rPr>
-        <w:t>：通过大模型对话接口逐一输入问题，记录完整回复内容（文本/看板），并保存日志（暂定-包括输入时间、回复时间、完整输出）。</w:t>
-      </w:r>
-    </w:p>
-    <w:p>
-      <w:pPr>
-        <w:numPr>
-          <w:numId w:val="21"/>
-        </w:numPr>
-        <w:spacing w:before="120" w:after="120" w:line="288" w:lineRule="auto"/>
-        <w:ind w:left="0"/>
-        <w:jc w:val="left"/>
-      </w:pPr>
-      <w:r>
-        <w:rPr>
-          <w:rFonts w:eastAsia="等线" w:ascii="Arial" w:cs="Arial" w:hAnsi="Arial"/>
-          <w:b w:val="true"/>
-          <w:sz w:val="22"/>
-        </w:rPr>
-        <w:t>结果验证</w:t>
-      </w:r>
-      <w:r>
-        <w:rPr>
-          <w:rFonts w:eastAsia="等线" w:ascii="Arial" w:cs="Arial" w:hAnsi="Arial"/>
-          <w:sz w:val="22"/>
-        </w:rPr>
-        <w:t>：手动计算准确性（非开放问题对比Ground Truth，开放问题按参考框架检查事实/逻辑/建议/完整），专家打分量化（1-5分平均），记录异常回复。</w:t>
-      </w:r>
-    </w:p>
-    <w:p>
-      <w:pPr>
-        <w:numPr>
-          <w:numId w:val="22"/>
-        </w:numPr>
-        <w:spacing w:before="120" w:after="120" w:line="288" w:lineRule="auto"/>
-        <w:ind w:left="0"/>
-        <w:jc w:val="left"/>
-      </w:pPr>
-      <w:r>
-        <w:rPr>
-          <w:rFonts w:eastAsia="等线" w:ascii="Arial" w:cs="Arial" w:hAnsi="Arial"/>
-          <w:b w:val="true"/>
-          <w:sz w:val="22"/>
-        </w:rPr>
-        <w:t>测试报告</w:t>
-      </w:r>
-      <w:r>
-        <w:rPr>
-          <w:rFonts w:eastAsia="等线" w:ascii="Arial" w:cs="Arial" w:hAnsi="Arial"/>
-          <w:sz w:val="22"/>
-        </w:rPr>
-        <w:t>：统计指标数据（表格呈现准确性/一致性结果），附好坏回复对比示例（汇报直观），并分析优化建议。</w:t>
-      </w:r>
-    </w:p>
-    <w:p>
-      <w:pPr>
-        <w:pStyle w:val="4"/>
-        <w:spacing w:before="260" w:after="120" w:line="288" w:lineRule="auto"/>
-        <w:ind w:left="0"/>
-        <w:jc w:val="left"/>
-        <w:outlineLvl w:val="3"/>
-      </w:pPr>
-      <w:bookmarkStart w:name="heading_6" w:id="6"/>
-      <w:bookmarkEnd w:id="6"/>
-    </w:p>
-    <w:p>
-      <w:pPr>
-        <w:spacing w:before="120" w:after="120" w:line="288" w:lineRule="auto"/>
-        <w:ind w:left="0"/>
-        <w:jc w:val="left"/>
-      </w:pPr>
-    </w:p>
-    <w:p>
-      <w:r>
-        <w:br w:type="page"/>
-      </w:r>
-    </w:p>
-    <w:p>
       <w:r>
         <w:rPr>
           <w:b/>
-          <w:sz w:val="32"/>
-        </w:rPr>
-        <w:t>附录：开放问题评估与打分标准（LLM-as-a-Judge 自动化打分法）</w:t>
-      </w:r>
-    </w:p>
-    <w:p>
-      <w:r>
-        <w:t xml:space="preserve">鉴于大模型（智能体）的输出为自由文本，且通常不会严格按照设定的“三段式”固定格式输出。为保证评分的客观性、一致性与高效性，测试方案引入 </w:t>
-      </w:r>
+          <w:sz w:val="24"/>
+        </w:rPr>
+        <w:t>（新增）LLM-as-a-Judge 自动化打分法（推荐用于开放问题）</w:t>
+      </w:r>
+    </w:p>
+    <w:p>
+      <w:r>
+        <w:t>鉴于大模型（智能体）的输出为自由文本，且通常不会严格按照设定的“三段式”固定格式输出。为保证评分的客观性、一致性与高效性，测试方案引入 LLM-as-a-Judge（用大模型当裁判）的自动化评分机制。</w:t>
+      </w:r>
+    </w:p>
+    <w:p>
       <w:r>
         <w:rPr>
           <w:b/>
         </w:rPr>
-        <w:t>LLM-as-a-Judge（用大模型当裁判）</w:t>
-      </w:r>
-      <w:r>
-        <w:t xml:space="preserve"> 的自动化评分机制。</w:t>
-      </w:r>
-    </w:p>
-    <w:p>
-      <w:r>
-        <w:rPr>
-          <w:b/>
-          <w:sz w:val="28"/>
-        </w:rPr>
-        <w:t>1. 核心评估理念</w:t>
+        <w:t>核心评估理念：</w:t>
       </w:r>
     </w:p>
     <w:p>
@@ -2204,9 +1603,8 @@
       <w:r>
         <w:rPr>
           <w:b/>
-          <w:sz w:val="28"/>
-        </w:rPr>
-        <w:t>2. LLM 裁判指令 (Prompt) 模板</w:t>
+        </w:rPr>
+        <w:t>LLM 裁判指令 (Prompt) 模板：</w:t>
       </w:r>
     </w:p>
     <w:p>
@@ -2251,29 +1649,611 @@
       <w:r>
         <w:rPr>
           <w:b/>
+        </w:rPr>
+        <w:t>自动化测试实施路径：</w:t>
+      </w:r>
+    </w:p>
+    <w:p>
+      <w:r>
+        <w:t>1. 通过 RPA 脚本或 API 批量拉取智能体对 80 道开放题的实际回答，并落盘至 result.xlsx 的“智能体回复”列。</w:t>
+        <w:br/>
+        <w:t>2. 编写评测脚本，循环读取“问题 + 标准答案 + 智能体回复”，将其拼接到上述 Prompt 模板中。</w:t>
+        <w:br/>
+        <w:t>3. 调用更高阶的大模型（如 GPT-4o 或 Claude 3.5 Sonnet）接口，让其以裁判身份输出分数与扣分理由。</w:t>
+        <w:br/>
+        <w:t>4. 汇总分数，计算整体平均分以及“准确性、洞察力、建议”等细分维度的达标率。</w:t>
+      </w:r>
+    </w:p>
+    <w:p/>
+    <w:p>
+      <w:pPr>
+        <w:pStyle w:val="4"/>
+        <w:spacing w:before="260" w:after="120" w:line="288" w:lineRule="auto"/>
+        <w:ind w:left="0"/>
+        <w:jc w:val="left"/>
+        <w:outlineLvl w:val="3"/>
+      </w:pPr>
+      <w:bookmarkStart w:name="heading_4" w:id="4"/>
+      <w:r>
+        <w:rPr>
+          <w:rFonts w:eastAsia="等线" w:ascii="Arial" w:cs="Arial" w:hAnsi="Arial"/>
+          <w:b w:val="true"/>
           <w:sz w:val="28"/>
         </w:rPr>
-        <w:t>3. 自动化测试实施路径</w:t>
-      </w:r>
-    </w:p>
-    <w:p>
-      <w:r>
-        <w:t>步骤一：通过 RPA 脚本或 API 批量拉取智能体对 80 道开放题的实际回答，并落盘至 result.xlsx 的“智能体回复”列。</w:t>
-      </w:r>
-    </w:p>
-    <w:p>
-      <w:r>
-        <w:t>步骤二：编写评测脚本，循环读取“问题 + 标准答案 + 智能体回复”，将其拼接到上述 Prompt 模板中。</w:t>
-      </w:r>
-    </w:p>
-    <w:p>
-      <w:r>
-        <w:t>步骤三：调用更高阶的大模型（如 GPT-4o 或 Claude 3.5 Sonnet）接口，让其以裁判身份输出分数与扣分理由。</w:t>
-      </w:r>
-    </w:p>
-    <w:p>
-      <w:r>
-        <w:t>步骤四：汇总分数，计算整体平均分以及“准确性、洞察力、建议”等细分维度的达标率。</w:t>
+        <w:t>四. 测试指标</w:t>
+      </w:r>
+      <w:bookmarkEnd w:id="4"/>
+    </w:p>
+    <w:tbl>
+      <w:tblPr>
+        <w:tblW w:w="0" w:type="auto"/>
+        <w:tblInd w:w="0" w:type="dxa"/>
+        <w:tblBorders>
+          <w:top w:val="single" w:color="dee0e3"/>
+          <w:left w:val="single" w:color="dee0e3"/>
+          <w:bottom w:val="single" w:color="dee0e3"/>
+          <w:right w:val="single" w:color="dee0e3"/>
+          <w:insideH w:val="single" w:color="dee0e3"/>
+          <w:insideV w:val="single" w:color="dee0e3"/>
+        </w:tblBorders>
+        <w:tblLayout w:type="fixed"/>
+      </w:tblPr>
+      <w:tblGrid>
+        <w:gridCol w:w="1560"/>
+        <w:gridCol w:w="1680"/>
+        <w:gridCol w:w="1680"/>
+        <w:gridCol w:w="1680"/>
+        <w:gridCol w:w="1680"/>
+      </w:tblGrid>
+      <w:tr>
+        <w:tc>
+          <w:tcPr>
+            <w:tcW w:w="1560" w:type="dxa"/>
+            <w:tcMar>
+              <w:top w:type="dxa" w:w="60"/>
+              <w:left w:type="dxa" w:w="120"/>
+              <w:bottom w:type="dxa" w:w="30"/>
+              <w:right w:type="dxa" w:w="120"/>
+            </w:tcMar>
+          </w:tcPr>
+          <w:p>
+            <w:pPr>
+              <w:spacing w:before="120" w:after="120" w:line="288" w:lineRule="auto"/>
+              <w:ind w:left="0"/>
+              <w:jc w:val="left"/>
+            </w:pPr>
+            <w:r>
+              <w:rPr>
+                <w:rFonts w:eastAsia="等线" w:ascii="Arial" w:cs="Arial" w:hAnsi="Arial"/>
+                <w:sz w:val="22"/>
+              </w:rPr>
+              <w:t>指标名称</w:t>
+            </w:r>
+          </w:p>
+        </w:tc>
+        <w:tc>
+          <w:tcPr>
+            <w:tcW w:w="1680" w:type="dxa"/>
+            <w:tcMar>
+              <w:top w:type="dxa" w:w="60"/>
+              <w:left w:type="dxa" w:w="120"/>
+              <w:bottom w:type="dxa" w:w="30"/>
+              <w:right w:type="dxa" w:w="120"/>
+            </w:tcMar>
+          </w:tcPr>
+          <w:p>
+            <w:pPr>
+              <w:spacing w:before="120" w:after="120" w:line="288" w:lineRule="auto"/>
+              <w:ind w:left="0"/>
+              <w:jc w:val="left"/>
+            </w:pPr>
+            <w:r>
+              <w:rPr>
+                <w:rFonts w:eastAsia="等线" w:ascii="Arial" w:cs="Arial" w:hAnsi="Arial"/>
+                <w:sz w:val="22"/>
+              </w:rPr>
+              <w:t>定义</w:t>
+            </w:r>
+          </w:p>
+        </w:tc>
+        <w:tc>
+          <w:tcPr>
+            <w:tcW w:w="1680" w:type="dxa"/>
+            <w:tcMar>
+              <w:top w:type="dxa" w:w="60"/>
+              <w:left w:type="dxa" w:w="120"/>
+              <w:bottom w:type="dxa" w:w="30"/>
+              <w:right w:type="dxa" w:w="120"/>
+            </w:tcMar>
+          </w:tcPr>
+          <w:p>
+            <w:pPr>
+              <w:spacing w:before="120" w:after="120" w:line="288" w:lineRule="auto"/>
+              <w:ind w:left="0"/>
+              <w:jc w:val="left"/>
+            </w:pPr>
+            <w:r>
+              <w:rPr>
+                <w:rFonts w:eastAsia="等线" w:ascii="Arial" w:cs="Arial" w:hAnsi="Arial"/>
+                <w:sz w:val="22"/>
+              </w:rPr>
+              <w:t>计算方式</w:t>
+            </w:r>
+          </w:p>
+        </w:tc>
+        <w:tc>
+          <w:tcPr>
+            <w:tcW w:w="1680" w:type="dxa"/>
+            <w:tcMar>
+              <w:top w:type="dxa" w:w="60"/>
+              <w:left w:type="dxa" w:w="120"/>
+              <w:bottom w:type="dxa" w:w="30"/>
+              <w:right w:type="dxa" w:w="120"/>
+            </w:tcMar>
+          </w:tcPr>
+          <w:p>
+            <w:pPr>
+              <w:spacing w:before="120" w:after="120" w:line="288" w:lineRule="auto"/>
+              <w:ind w:left="0"/>
+              <w:jc w:val="left"/>
+            </w:pPr>
+            <w:r>
+              <w:rPr>
+                <w:rFonts w:eastAsia="等线" w:ascii="Arial" w:cs="Arial" w:hAnsi="Arial"/>
+                <w:sz w:val="22"/>
+              </w:rPr>
+              <w:t>目标阈值</w:t>
+            </w:r>
+          </w:p>
+        </w:tc>
+        <w:tc>
+          <w:tcPr>
+            <w:tcW w:w="1680" w:type="dxa"/>
+            <w:tcMar>
+              <w:top w:type="dxa" w:w="60"/>
+              <w:left w:type="dxa" w:w="120"/>
+              <w:bottom w:type="dxa" w:w="30"/>
+              <w:right w:type="dxa" w:w="120"/>
+            </w:tcMar>
+          </w:tcPr>
+          <w:p>
+            <w:pPr>
+              <w:spacing w:before="120" w:after="120" w:line="288" w:lineRule="auto"/>
+              <w:ind w:left="0"/>
+              <w:jc w:val="left"/>
+            </w:pPr>
+            <w:r>
+              <w:rPr>
+                <w:rFonts w:eastAsia="等线" w:ascii="Arial" w:cs="Arial" w:hAnsi="Arial"/>
+                <w:sz w:val="22"/>
+              </w:rPr>
+              <w:t>适用问题类型</w:t>
+            </w:r>
+          </w:p>
+        </w:tc>
+      </w:tr>
+      <w:tr>
+        <w:tc>
+          <w:tcPr>
+            <w:tcW w:w="1560" w:type="dxa"/>
+            <w:tcMar>
+              <w:top w:type="dxa" w:w="60"/>
+              <w:left w:type="dxa" w:w="120"/>
+              <w:bottom w:type="dxa" w:w="30"/>
+              <w:right w:type="dxa" w:w="120"/>
+            </w:tcMar>
+          </w:tcPr>
+          <w:p>
+            <w:pPr>
+              <w:spacing w:before="120" w:after="120" w:line="288" w:lineRule="auto"/>
+              <w:ind w:left="0"/>
+              <w:jc w:val="left"/>
+            </w:pPr>
+            <w:r>
+              <w:rPr>
+                <w:rFonts w:eastAsia="等线" w:ascii="Arial" w:cs="Arial" w:hAnsi="Arial"/>
+                <w:sz w:val="22"/>
+              </w:rPr>
+              <w:t>准确性</w:t>
+            </w:r>
+          </w:p>
+        </w:tc>
+        <w:tc>
+          <w:tcPr>
+            <w:tcW w:w="1680" w:type="dxa"/>
+            <w:tcMar>
+              <w:top w:type="dxa" w:w="60"/>
+              <w:left w:type="dxa" w:w="120"/>
+              <w:bottom w:type="dxa" w:w="30"/>
+              <w:right w:type="dxa" w:w="120"/>
+            </w:tcMar>
+          </w:tcPr>
+          <w:p>
+            <w:pPr>
+              <w:spacing w:before="120" w:after="120" w:line="288" w:lineRule="auto"/>
+              <w:ind w:left="0"/>
+              <w:jc w:val="left"/>
+            </w:pPr>
+            <w:r>
+              <w:rPr>
+                <w:rFonts w:eastAsia="等线" w:ascii="Arial" w:cs="Arial" w:hAnsi="Arial"/>
+                <w:sz w:val="22"/>
+              </w:rPr>
+              <w:t>回复的对不对</w:t>
+            </w:r>
+          </w:p>
+        </w:tc>
+        <w:tc>
+          <w:tcPr>
+            <w:tcW w:w="1680" w:type="dxa"/>
+            <w:tcMar>
+              <w:top w:type="dxa" w:w="60"/>
+              <w:left w:type="dxa" w:w="120"/>
+              <w:bottom w:type="dxa" w:w="30"/>
+              <w:right w:type="dxa" w:w="120"/>
+            </w:tcMar>
+          </w:tcPr>
+          <w:p>
+            <w:pPr>
+              <w:spacing w:before="120" w:after="120" w:line="288" w:lineRule="auto"/>
+              <w:ind w:left="0"/>
+              <w:jc w:val="left"/>
+            </w:pPr>
+            <w:r>
+              <w:rPr>
+                <w:rFonts w:eastAsia="等线" w:ascii="Arial" w:cs="Arial" w:hAnsi="Arial"/>
+                <w:sz w:val="22"/>
+              </w:rPr>
+              <w:t>每条问题1-5分专家平均分</w:t>
+            </w:r>
+          </w:p>
+        </w:tc>
+        <w:tc>
+          <w:tcPr>
+            <w:tcW w:w="1680" w:type="dxa"/>
+            <w:tcMar>
+              <w:top w:type="dxa" w:w="60"/>
+              <w:left w:type="dxa" w:w="120"/>
+              <w:bottom w:type="dxa" w:w="30"/>
+              <w:right w:type="dxa" w:w="120"/>
+            </w:tcMar>
+          </w:tcPr>
+          <w:p>
+            <w:pPr>
+              <w:spacing w:before="120" w:after="120" w:line="288" w:lineRule="auto"/>
+              <w:ind w:left="0"/>
+              <w:jc w:val="left"/>
+            </w:pPr>
+            <w:r>
+              <w:rPr>
+                <w:rFonts w:eastAsia="等线" w:ascii="Arial" w:cs="Arial" w:hAnsi="Arial"/>
+                <w:sz w:val="22"/>
+                <w:shd w:fill="f76964"/>
+              </w:rPr>
+              <w:t>平均≥4.5分</w:t>
+            </w:r>
+          </w:p>
+        </w:tc>
+        <w:tc>
+          <w:tcPr>
+            <w:tcW w:w="1680" w:type="dxa"/>
+            <w:tcMar>
+              <w:top w:type="dxa" w:w="60"/>
+              <w:left w:type="dxa" w:w="120"/>
+              <w:bottom w:type="dxa" w:w="30"/>
+              <w:right w:type="dxa" w:w="120"/>
+            </w:tcMar>
+          </w:tcPr>
+          <w:p>
+            <w:pPr>
+              <w:spacing w:before="120" w:after="120" w:line="288" w:lineRule="auto"/>
+              <w:ind w:left="0"/>
+              <w:jc w:val="left"/>
+            </w:pPr>
+            <w:r>
+              <w:rPr>
+                <w:rFonts w:eastAsia="等线" w:ascii="Arial" w:cs="Arial" w:hAnsi="Arial"/>
+                <w:sz w:val="22"/>
+              </w:rPr>
+              <w:t>开放 + 非开放</w:t>
+            </w:r>
+          </w:p>
+        </w:tc>
+      </w:tr>
+      <w:tr>
+        <w:tc>
+          <w:tcPr>
+            <w:tcW w:w="1560" w:type="dxa"/>
+            <w:tcMar>
+              <w:top w:type="dxa" w:w="60"/>
+              <w:left w:type="dxa" w:w="120"/>
+              <w:bottom w:type="dxa" w:w="30"/>
+              <w:right w:type="dxa" w:w="120"/>
+            </w:tcMar>
+          </w:tcPr>
+          <w:p>
+            <w:pPr>
+              <w:spacing w:before="120" w:after="120" w:line="288" w:lineRule="auto"/>
+              <w:ind w:left="0"/>
+              <w:jc w:val="left"/>
+            </w:pPr>
+            <w:r>
+              <w:rPr>
+                <w:rFonts w:eastAsia="等线" w:ascii="Arial" w:cs="Arial" w:hAnsi="Arial"/>
+                <w:sz w:val="22"/>
+              </w:rPr>
+              <w:t>一致性</w:t>
+            </w:r>
+          </w:p>
+        </w:tc>
+        <w:tc>
+          <w:tcPr>
+            <w:tcW w:w="1680" w:type="dxa"/>
+            <w:tcMar>
+              <w:top w:type="dxa" w:w="60"/>
+              <w:left w:type="dxa" w:w="120"/>
+              <w:bottom w:type="dxa" w:w="30"/>
+              <w:right w:type="dxa" w:w="120"/>
+            </w:tcMar>
+          </w:tcPr>
+          <w:p>
+            <w:pPr>
+              <w:spacing w:before="120" w:after="120" w:line="288" w:lineRule="auto"/>
+              <w:ind w:left="0"/>
+              <w:jc w:val="left"/>
+            </w:pPr>
+            <w:r>
+              <w:rPr>
+                <w:rFonts w:eastAsia="等线" w:ascii="Arial" w:cs="Arial" w:hAnsi="Arial"/>
+                <w:sz w:val="22"/>
+              </w:rPr>
+              <w:t>相同问题多次运行输出相同</w:t>
+            </w:r>
+          </w:p>
+        </w:tc>
+        <w:tc>
+          <w:tcPr>
+            <w:tcW w:w="1680" w:type="dxa"/>
+            <w:tcMar>
+              <w:top w:type="dxa" w:w="60"/>
+              <w:left w:type="dxa" w:w="120"/>
+              <w:bottom w:type="dxa" w:w="30"/>
+              <w:right w:type="dxa" w:w="120"/>
+            </w:tcMar>
+          </w:tcPr>
+          <w:p>
+            <w:pPr>
+              <w:spacing w:before="120" w:after="120" w:line="288" w:lineRule="auto"/>
+              <w:ind w:left="0"/>
+              <w:jc w:val="left"/>
+            </w:pPr>
+            <w:r>
+              <w:rPr>
+                <w:rFonts w:eastAsia="等线" w:ascii="Arial" w:cs="Arial" w:hAnsi="Arial"/>
+                <w:sz w:val="22"/>
+              </w:rPr>
+              <w:t>20次运行零差异率</w:t>
+            </w:r>
+          </w:p>
+        </w:tc>
+        <w:tc>
+          <w:tcPr>
+            <w:tcW w:w="1680" w:type="dxa"/>
+            <w:tcMar>
+              <w:top w:type="dxa" w:w="60"/>
+              <w:left w:type="dxa" w:w="120"/>
+              <w:bottom w:type="dxa" w:w="30"/>
+              <w:right w:type="dxa" w:w="120"/>
+            </w:tcMar>
+          </w:tcPr>
+          <w:p>
+            <w:pPr>
+              <w:spacing w:before="120" w:after="120" w:line="288" w:lineRule="auto"/>
+              <w:ind w:left="0"/>
+              <w:jc w:val="left"/>
+            </w:pPr>
+            <w:r>
+              <w:rPr>
+                <w:rFonts w:eastAsia="等线" w:ascii="Arial" w:cs="Arial" w:hAnsi="Arial"/>
+                <w:sz w:val="22"/>
+                <w:shd w:fill="f76964"/>
+              </w:rPr>
+              <w:t>100%</w:t>
+            </w:r>
+          </w:p>
+        </w:tc>
+        <w:tc>
+          <w:tcPr>
+            <w:tcW w:w="1680" w:type="dxa"/>
+            <w:tcMar>
+              <w:top w:type="dxa" w:w="60"/>
+              <w:left w:type="dxa" w:w="120"/>
+              <w:bottom w:type="dxa" w:w="30"/>
+              <w:right w:type="dxa" w:w="120"/>
+            </w:tcMar>
+          </w:tcPr>
+          <w:p>
+            <w:pPr>
+              <w:spacing w:before="120" w:after="120" w:line="288" w:lineRule="auto"/>
+              <w:ind w:left="0"/>
+              <w:jc w:val="left"/>
+            </w:pPr>
+            <w:r>
+              <w:rPr>
+                <w:rFonts w:eastAsia="等线" w:ascii="Arial" w:cs="Arial" w:hAnsi="Arial"/>
+                <w:sz w:val="22"/>
+              </w:rPr>
+              <w:t>两者均适用</w:t>
+            </w:r>
+          </w:p>
+        </w:tc>
+      </w:tr>
+    </w:tbl>
+    <w:p>
+      <w:pPr>
+        <w:numPr>
+          <w:numId w:val="18"/>
+        </w:numPr>
+        <w:spacing w:before="120" w:after="120" w:line="288" w:lineRule="auto"/>
+        <w:ind w:left="0"/>
+        <w:jc w:val="left"/>
+      </w:pPr>
+      <w:r>
+        <w:rPr>
+          <w:rFonts w:eastAsia="等线" w:ascii="Arial" w:cs="Arial" w:hAnsi="Arial"/>
+          <w:b w:val="true"/>
+          <w:sz w:val="22"/>
+        </w:rPr>
+        <w:t>综合通过</w:t>
+      </w:r>
+      <w:r>
+        <w:rPr>
+          <w:rFonts w:eastAsia="等线" w:ascii="Arial" w:cs="Arial" w:hAnsi="Arial"/>
+          <w:sz w:val="22"/>
+        </w:rPr>
+        <w:t>：准确性≥4.5分 + 一致性100% 。</w:t>
+      </w:r>
+    </w:p>
+    <w:p>
+      <w:pPr>
+        <w:pStyle w:val="4"/>
+        <w:spacing w:before="260" w:after="120" w:line="288" w:lineRule="auto"/>
+        <w:ind w:left="0"/>
+        <w:jc w:val="left"/>
+        <w:outlineLvl w:val="3"/>
+      </w:pPr>
+      <w:bookmarkStart w:name="heading_5" w:id="5"/>
+      <w:r>
+        <w:rPr>
+          <w:rFonts w:eastAsia="等线" w:ascii="Arial" w:cs="Arial" w:hAnsi="Arial"/>
+          <w:b w:val="true"/>
+          <w:sz w:val="28"/>
+        </w:rPr>
+        <w:t>五. 测试执行流程</w:t>
+      </w:r>
+      <w:bookmarkEnd w:id="5"/>
+    </w:p>
+    <w:p>
+      <w:pPr>
+        <w:numPr>
+          <w:numId w:val="19"/>
+        </w:numPr>
+        <w:spacing w:before="120" w:after="120" w:line="288" w:lineRule="auto"/>
+        <w:ind w:left="0"/>
+        <w:jc w:val="left"/>
+      </w:pPr>
+      <w:r>
+        <w:rPr>
+          <w:rFonts w:eastAsia="等线" w:ascii="Arial" w:cs="Arial" w:hAnsi="Arial"/>
+          <w:b w:val="true"/>
+          <w:sz w:val="22"/>
+        </w:rPr>
+        <w:t>问题集构造</w:t>
+      </w:r>
+      <w:r>
+        <w:rPr>
+          <w:rFonts w:eastAsia="等线" w:ascii="Arial" w:cs="Arial" w:hAnsi="Arial"/>
+          <w:sz w:val="22"/>
+        </w:rPr>
+        <w:t>：构造80-100个问题（覆盖业务全链，包括非开放和开放问题），确保问题多样性（简单事实查询到深度分析 + 建议），并预定义每个问题的Ground Truth或参考框架。</w:t>
+      </w:r>
+    </w:p>
+    <w:p>
+      <w:pPr>
+        <w:numPr>
+          <w:numId w:val="20"/>
+        </w:numPr>
+        <w:spacing w:before="120" w:after="120" w:line="288" w:lineRule="auto"/>
+        <w:ind w:left="0"/>
+        <w:jc w:val="left"/>
+      </w:pPr>
+      <w:r>
+        <w:rPr>
+          <w:rFonts w:eastAsia="等线" w:ascii="Arial" w:cs="Arial" w:hAnsi="Arial"/>
+          <w:b w:val="true"/>
+          <w:sz w:val="22"/>
+        </w:rPr>
+        <w:t>测试运行</w:t>
+      </w:r>
+      <w:r>
+        <w:rPr>
+          <w:rFonts w:eastAsia="等线" w:ascii="Arial" w:cs="Arial" w:hAnsi="Arial"/>
+          <w:sz w:val="22"/>
+        </w:rPr>
+        <w:t>：通过大模型对话接口逐一输入问题，记录完整回复内容（文本/看板），并保存日志（暂定-包括输入时间、回复时间、完整输出）。</w:t>
+      </w:r>
+    </w:p>
+    <w:p>
+      <w:pPr>
+        <w:numPr>
+          <w:numId w:val="21"/>
+        </w:numPr>
+        <w:spacing w:before="120" w:after="120" w:line="288" w:lineRule="auto"/>
+        <w:ind w:left="0"/>
+        <w:jc w:val="left"/>
+      </w:pPr>
+      <w:r>
+        <w:rPr>
+          <w:rFonts w:eastAsia="等线" w:ascii="Arial" w:cs="Arial" w:hAnsi="Arial"/>
+          <w:b w:val="true"/>
+          <w:sz w:val="22"/>
+        </w:rPr>
+        <w:t>结果验证</w:t>
+      </w:r>
+      <w:r>
+        <w:rPr>
+          <w:rFonts w:eastAsia="等线" w:ascii="Arial" w:cs="Arial" w:hAnsi="Arial"/>
+          <w:sz w:val="22"/>
+        </w:rPr>
+        <w:t>：手动计算准确性（非开放问题对比Ground Truth，开放问题按参考框架检查事实/逻辑/建议/完整），专家打分量化（1-5分平均），记录异常回复。</w:t>
+      </w:r>
+    </w:p>
+    <w:p>
+      <w:pPr>
+        <w:numPr>
+          <w:numId w:val="22"/>
+        </w:numPr>
+        <w:spacing w:before="120" w:after="120" w:line="288" w:lineRule="auto"/>
+        <w:ind w:left="0"/>
+        <w:jc w:val="left"/>
+      </w:pPr>
+      <w:r>
+        <w:rPr>
+          <w:rFonts w:eastAsia="等线" w:ascii="Arial" w:cs="Arial" w:hAnsi="Arial"/>
+          <w:b w:val="true"/>
+          <w:sz w:val="22"/>
+        </w:rPr>
+        <w:t>测试报告</w:t>
+      </w:r>
+      <w:r>
+        <w:rPr>
+          <w:rFonts w:eastAsia="等线" w:ascii="Arial" w:cs="Arial" w:hAnsi="Arial"/>
+          <w:sz w:val="22"/>
+        </w:rPr>
+        <w:t>：统计指标数据（表格呈现准确性/一致性结果），附好坏回复对比示例（汇报直观），并分析优化建议。</w:t>
+      </w:r>
+    </w:p>
+    <w:p>
+      <w:pPr>
+        <w:pStyle w:val="4"/>
+        <w:spacing w:before="260" w:after="120" w:line="288" w:lineRule="auto"/>
+        <w:ind w:left="0"/>
+        <w:jc w:val="left"/>
+        <w:outlineLvl w:val="3"/>
+      </w:pPr>
+      <w:bookmarkStart w:name="heading_6" w:id="6"/>
+      <w:bookmarkEnd w:id="6"/>
+    </w:p>
+    <w:p>
+      <w:pPr>
+        <w:spacing w:before="120" w:after="120" w:line="288" w:lineRule="auto"/>
+        <w:ind w:left="0"/>
+        <w:jc w:val="left"/>
+      </w:pPr>
+    </w:p>
+    <w:p>
+      <w:r>
+        <w:br w:type="page"/>
       </w:r>
     </w:p>
     <w:sectPr>

</xml_diff>

<commit_message>
update: completely rewrite and extremely optimize the test execution process section in docx
Made-with: Cursor
</commit_message>
<xml_diff>
--- a/test_plan/经分智能体测试方案2.0.docx
+++ b/test_plan/经分智能体测试方案2.0.docx
@@ -1969,145 +1969,33 @@
       </w:r>
     </w:p>
     <w:p>
-      <w:pPr>
-        <w:pStyle w:val="4"/>
-        <w:spacing w:before="260" w:after="120" w:line="288" w:lineRule="auto"/>
-        <w:ind w:left="0"/>
-        <w:jc w:val="left"/>
-        <w:outlineLvl w:val="3"/>
-      </w:pPr>
-      <w:bookmarkStart w:name="heading_5" w:id="5"/>
-      <w:r>
-        <w:rPr>
-          <w:rFonts w:eastAsia="等线" w:ascii="Arial" w:cs="Arial" w:hAnsi="Arial"/>
-          <w:b w:val="true"/>
-          <w:sz w:val="28"/>
-        </w:rPr>
-        <w:t>五. 测试执行流程</w:t>
-      </w:r>
-      <w:bookmarkEnd w:id="5"/>
-    </w:p>
-    <w:p>
-      <w:pPr>
-        <w:numPr>
-          <w:numId w:val="19"/>
-        </w:numPr>
-        <w:spacing w:before="120" w:after="120" w:line="288" w:lineRule="auto"/>
-        <w:ind w:left="0"/>
-        <w:jc w:val="left"/>
-      </w:pPr>
-      <w:r>
-        <w:rPr>
-          <w:rFonts w:eastAsia="等线" w:ascii="Arial" w:cs="Arial" w:hAnsi="Arial"/>
-          <w:b w:val="true"/>
-          <w:sz w:val="22"/>
-        </w:rPr>
-        <w:t>问题集构造</w:t>
-      </w:r>
-      <w:r>
-        <w:rPr>
-          <w:rFonts w:eastAsia="等线" w:ascii="Arial" w:cs="Arial" w:hAnsi="Arial"/>
-          <w:sz w:val="22"/>
-        </w:rPr>
-        <w:t>：构造80-100个问题（覆盖业务全链，包括非开放和开放问题），确保问题多样性（简单事实查询到深度分析 + 建议），并预定义每个问题的Ground Truth或参考框架。</w:t>
-      </w:r>
-    </w:p>
-    <w:p>
-      <w:pPr>
-        <w:numPr>
-          <w:numId w:val="20"/>
-        </w:numPr>
-        <w:spacing w:before="120" w:after="120" w:line="288" w:lineRule="auto"/>
-        <w:ind w:left="0"/>
-        <w:jc w:val="left"/>
-      </w:pPr>
-      <w:r>
-        <w:rPr>
-          <w:rFonts w:eastAsia="等线" w:ascii="Arial" w:cs="Arial" w:hAnsi="Arial"/>
-          <w:b w:val="true"/>
-          <w:sz w:val="22"/>
-        </w:rPr>
-        <w:t>测试运行</w:t>
-      </w:r>
-      <w:r>
-        <w:rPr>
-          <w:rFonts w:eastAsia="等线" w:ascii="Arial" w:cs="Arial" w:hAnsi="Arial"/>
-          <w:sz w:val="22"/>
-        </w:rPr>
-        <w:t>：通过大模型对话接口逐一输入问题，记录完整回复内容（文本/看板），并保存日志（暂定-包括输入时间、回复时间、完整输出）。</w:t>
-      </w:r>
-    </w:p>
-    <w:p>
-      <w:pPr>
-        <w:numPr>
-          <w:numId w:val="21"/>
-        </w:numPr>
-        <w:spacing w:before="120" w:after="120" w:line="288" w:lineRule="auto"/>
-        <w:ind w:left="0"/>
-        <w:jc w:val="left"/>
-      </w:pPr>
-      <w:r>
-        <w:rPr>
-          <w:rFonts w:eastAsia="等线" w:ascii="Arial" w:cs="Arial" w:hAnsi="Arial"/>
-          <w:b w:val="true"/>
-          <w:sz w:val="22"/>
-        </w:rPr>
-        <w:t>结果验证</w:t>
-      </w:r>
-      <w:r>
-        <w:rPr>
-          <w:rFonts w:eastAsia="等线" w:ascii="Arial" w:cs="Arial" w:hAnsi="Arial"/>
-          <w:sz w:val="22"/>
-        </w:rPr>
-        <w:t>：手动计算准确性（非开放问题对比Ground Truth，开放问题按参考框架检查事实/逻辑/建议/完整），专家打分量化（1-5分平均），记录异常回复。</w:t>
-      </w:r>
-    </w:p>
-    <w:p>
-      <w:pPr>
-        <w:numPr>
-          <w:numId w:val="22"/>
-        </w:numPr>
-        <w:spacing w:before="120" w:after="120" w:line="288" w:lineRule="auto"/>
-        <w:ind w:left="0"/>
-        <w:jc w:val="left"/>
-      </w:pPr>
-      <w:r>
-        <w:rPr>
-          <w:rFonts w:eastAsia="等线" w:ascii="Arial" w:cs="Arial" w:hAnsi="Arial"/>
-          <w:b w:val="true"/>
-          <w:sz w:val="22"/>
-        </w:rPr>
-        <w:t>测试报告</w:t>
-      </w:r>
-      <w:r>
-        <w:rPr>
-          <w:rFonts w:eastAsia="等线" w:ascii="Arial" w:cs="Arial" w:hAnsi="Arial"/>
-          <w:sz w:val="22"/>
-        </w:rPr>
-        <w:t>：统计指标数据（表格呈现准确性/一致性结果），附好坏回复对比示例（汇报直观），并分析优化建议。</w:t>
-      </w:r>
-    </w:p>
-    <w:p>
-      <w:pPr>
-        <w:pStyle w:val="4"/>
-        <w:spacing w:before="260" w:after="120" w:line="288" w:lineRule="auto"/>
-        <w:ind w:left="0"/>
-        <w:jc w:val="left"/>
-        <w:outlineLvl w:val="3"/>
-      </w:pPr>
-      <w:bookmarkStart w:name="heading_6" w:id="6"/>
-      <w:bookmarkEnd w:id="6"/>
-    </w:p>
-    <w:p>
-      <w:pPr>
-        <w:spacing w:before="120" w:after="120" w:line="288" w:lineRule="auto"/>
-        <w:ind w:left="0"/>
-        <w:jc w:val="left"/>
-      </w:pPr>
-    </w:p>
-    <w:p>
-      <w:r>
-        <w:br w:type="page"/>
+      <w:pPr/>
+      <w:r>
+        <w:t>五. 自动化与智能化测试执行流程</w:t>
+      </w:r>
+    </w:p>
+    <w:p>
+      <w:r>
+        <w:t>1. 题库构建与基准锁定 (Test Case Engineering)：基于真实的「商机表」与「合同表」等底层核心数据，构建 80 道高拟真度经营分析问题（50 道高阶逻辑非开放题 + 30 道老板视角灵魂拷问开放题）。通过 Python 脚本计算并绝对锁定各题的 Ground Truth 及「三段式」评估基准，确保后续裁判标准的零误差与客观性。</w:t>
+      </w:r>
+    </w:p>
+    <w:p>
+      <w:r>
+        <w:t>2. RPA 无人值守执行 (Robotic Process Automation)：引入 Playwright 自动化引擎，挂载 RPA 脚本对智能体交互界面进行无人值守跑批提问。脚本将自动注入测试数据、监听动态流式输出、提取完整回答文本，并将结果秒级落盘至数据表（result.xlsx），彻底消除人工操作带来的低效与人为干扰。</w:t>
+      </w:r>
+    </w:p>
+    <w:p>
+      <w:r>
+        <w:t>3. 双轨智能交叉验证 (Dual-Track Validation)：</w:t>
+        <w:br/>
+        <w:t xml:space="preserve">   • 非开放题（硬性校验）：通过正则提取与实体识别脚本，将智能体回复的数值、列表与 Ground Truth 进行毫秒级精准比对。</w:t>
+        <w:br/>
+        <w:t xml:space="preserve">   • 开放题（LLM-as-a-Judge）：将智能体输出的非结构化长文本喂入高阶裁判大模型，严格按照「事实准确度、业务洞察力、建议可行性」三维评分矩阵进行语义解析与量化打分。仅对裁判给出的异常低分或涉嫌“严重幻觉”的案例触发人工复检（Human-in-the-loop），实现极高水准的评测自动化率。</w:t>
+      </w:r>
+    </w:p>
+    <w:p>
+      <w:r>
+        <w:t>4. 缺陷洞察与高维报告产出 (Metrics &amp; Insights Reporting)：聚合准确性、一致性与无幻觉性三大核心指标，自动生成可视化评测矩阵。拒绝只交出冰冷的测试分数，着重提炼智能体在“意图理解偏差、底层数据检索遗漏、深层逻辑推理断层”等维度的典型 Bad Case，用以反向倒逼经分智能体底层 RAG 链路与架构的精准迭代。</w:t>
       </w:r>
     </w:p>
     <w:sectPr>

</xml_diff>

<commit_message>
update: extremely optimize the test metrics section in docx with 3D Core Evaluation Metrics
Made-with: Cursor
</commit_message>
<xml_diff>
--- a/test_plan/经分智能体测试方案2.0.docx
+++ b/test_plan/经分智能体测试方案2.0.docx
@@ -1527,161 +1527,77 @@
         <w:jc w:val="left"/>
         <w:outlineLvl w:val="3"/>
       </w:pPr>
-      <w:bookmarkStart w:name="heading_4" w:id="4"/>
-      <w:r>
-        <w:rPr>
-          <w:rFonts w:eastAsia="等线" w:ascii="Arial" w:cs="Arial" w:hAnsi="Arial"/>
-          <w:b w:val="true"/>
-          <w:sz w:val="28"/>
-        </w:rPr>
-        <w:t>四. 测试指标</w:t>
-      </w:r>
-      <w:bookmarkEnd w:id="4"/>
-    </w:p>
+      <w:r>
+        <w:t>四. 核心度量指标体系 (Core Evaluation Metrics)</w:t>
+      </w:r>
+    </w:p>
+    <w:p>
+      <w:r>
+        <w:t>本方案摒弃了传统的单一黑盒打分，构建了涵盖“精确度、鲁棒性、可溯源性”的 3D 黄金度量矩阵，以确保智能体在真实高管应用场景下的极致可靠。</w:t>
+      </w:r>
+    </w:p>
+    <w:p/>
+    <w:p/>
     <w:tbl>
       <w:tblPr>
-        <w:tblW w:w="0" w:type="auto"/>
-        <w:tblInd w:w="0" w:type="dxa"/>
-        <w:tblBorders>
-          <w:top w:val="single" w:color="dee0e3"/>
-          <w:left w:val="single" w:color="dee0e3"/>
-          <w:bottom w:val="single" w:color="dee0e3"/>
-          <w:right w:val="single" w:color="dee0e3"/>
-          <w:insideH w:val="single" w:color="dee0e3"/>
-          <w:insideV w:val="single" w:color="dee0e3"/>
-        </w:tblBorders>
-        <w:tblLayout w:type="fixed"/>
+        <w:tblW w:type="auto" w:w="0"/>
+        <w:tblLook w:firstColumn="1" w:firstRow="1" w:lastColumn="0" w:lastRow="0" w:noHBand="0" w:noVBand="1" w:val="04A0"/>
       </w:tblPr>
       <w:tblGrid>
-        <w:gridCol w:w="1560"/>
-        <w:gridCol w:w="1680"/>
-        <w:gridCol w:w="1680"/>
-        <w:gridCol w:w="1680"/>
-        <w:gridCol w:w="1680"/>
+        <w:gridCol w:w="1728"/>
+        <w:gridCol w:w="1728"/>
+        <w:gridCol w:w="1728"/>
+        <w:gridCol w:w="1728"/>
+        <w:gridCol w:w="1728"/>
       </w:tblGrid>
       <w:tr>
         <w:tc>
           <w:tcPr>
-            <w:tcW w:w="1560" w:type="dxa"/>
-            <w:tcMar>
-              <w:top w:type="dxa" w:w="60"/>
-              <w:left w:type="dxa" w:w="120"/>
-              <w:bottom w:type="dxa" w:w="30"/>
-              <w:right w:type="dxa" w:w="120"/>
-            </w:tcMar>
-          </w:tcPr>
-          <w:p>
-            <w:pPr>
-              <w:spacing w:before="120" w:after="120" w:line="288" w:lineRule="auto"/>
-              <w:ind w:left="0"/>
-              <w:jc w:val="left"/>
-            </w:pPr>
-            <w:r>
-              <w:rPr>
-                <w:rFonts w:eastAsia="等线" w:ascii="Arial" w:cs="Arial" w:hAnsi="Arial"/>
-                <w:sz w:val="22"/>
-              </w:rPr>
-              <w:t>指标名称</w:t>
-            </w:r>
-          </w:p>
-        </w:tc>
-        <w:tc>
-          <w:tcPr>
-            <w:tcW w:w="1680" w:type="dxa"/>
-            <w:tcMar>
-              <w:top w:type="dxa" w:w="60"/>
-              <w:left w:type="dxa" w:w="120"/>
-              <w:bottom w:type="dxa" w:w="30"/>
-              <w:right w:type="dxa" w:w="120"/>
-            </w:tcMar>
-          </w:tcPr>
-          <w:p>
-            <w:pPr>
-              <w:spacing w:before="120" w:after="120" w:line="288" w:lineRule="auto"/>
-              <w:ind w:left="0"/>
-              <w:jc w:val="left"/>
-            </w:pPr>
-            <w:r>
-              <w:rPr>
-                <w:rFonts w:eastAsia="等线" w:ascii="Arial" w:cs="Arial" w:hAnsi="Arial"/>
-                <w:sz w:val="22"/>
-              </w:rPr>
-              <w:t>定义</w:t>
-            </w:r>
-          </w:p>
-        </w:tc>
-        <w:tc>
-          <w:tcPr>
-            <w:tcW w:w="1680" w:type="dxa"/>
-            <w:tcMar>
-              <w:top w:type="dxa" w:w="60"/>
-              <w:left w:type="dxa" w:w="120"/>
-              <w:bottom w:type="dxa" w:w="30"/>
-              <w:right w:type="dxa" w:w="120"/>
-            </w:tcMar>
-          </w:tcPr>
-          <w:p>
-            <w:pPr>
-              <w:spacing w:before="120" w:after="120" w:line="288" w:lineRule="auto"/>
-              <w:ind w:left="0"/>
-              <w:jc w:val="left"/>
-            </w:pPr>
-            <w:r>
-              <w:rPr>
-                <w:rFonts w:eastAsia="等线" w:ascii="Arial" w:cs="Arial" w:hAnsi="Arial"/>
-                <w:sz w:val="22"/>
-              </w:rPr>
-              <w:t>计算方式</w:t>
-            </w:r>
-          </w:p>
-        </w:tc>
-        <w:tc>
-          <w:tcPr>
-            <w:tcW w:w="1680" w:type="dxa"/>
-            <w:tcMar>
-              <w:top w:type="dxa" w:w="60"/>
-              <w:left w:type="dxa" w:w="120"/>
-              <w:bottom w:type="dxa" w:w="30"/>
-              <w:right w:type="dxa" w:w="120"/>
-            </w:tcMar>
-          </w:tcPr>
-          <w:p>
-            <w:pPr>
-              <w:spacing w:before="120" w:after="120" w:line="288" w:lineRule="auto"/>
-              <w:ind w:left="0"/>
-              <w:jc w:val="left"/>
-            </w:pPr>
-            <w:r>
-              <w:rPr>
-                <w:rFonts w:eastAsia="等线" w:ascii="Arial" w:cs="Arial" w:hAnsi="Arial"/>
-                <w:sz w:val="22"/>
-              </w:rPr>
-              <w:t>目标阈值</w:t>
-            </w:r>
-          </w:p>
-        </w:tc>
-        <w:tc>
-          <w:tcPr>
-            <w:tcW w:w="1680" w:type="dxa"/>
-            <w:tcMar>
-              <w:top w:type="dxa" w:w="60"/>
-              <w:left w:type="dxa" w:w="120"/>
-              <w:bottom w:type="dxa" w:w="30"/>
-              <w:right w:type="dxa" w:w="120"/>
-            </w:tcMar>
-          </w:tcPr>
-          <w:p>
-            <w:pPr>
-              <w:spacing w:before="120" w:after="120" w:line="288" w:lineRule="auto"/>
-              <w:ind w:left="0"/>
-              <w:jc w:val="left"/>
-            </w:pPr>
-            <w:r>
-              <w:rPr>
-                <w:rFonts w:eastAsia="等线" w:ascii="Arial" w:cs="Arial" w:hAnsi="Arial"/>
-                <w:sz w:val="22"/>
-              </w:rPr>
-              <w:t>适用问题类型</w:t>
+            <w:tcW w:type="dxa" w:w="1728"/>
+          </w:tcPr>
+          <w:p>
+            <w:r>
+              <w:t>核心度量维度</w:t>
+            </w:r>
+          </w:p>
+        </w:tc>
+        <w:tc>
+          <w:tcPr>
+            <w:tcW w:type="dxa" w:w="1728"/>
+          </w:tcPr>
+          <w:p>
+            <w:r>
+              <w:t>指标定义与评判逻辑</w:t>
+            </w:r>
+          </w:p>
+        </w:tc>
+        <w:tc>
+          <w:tcPr>
+            <w:tcW w:type="dxa" w:w="1728"/>
+          </w:tcPr>
+          <w:p>
+            <w:r>
+              <w:t>量化计算方式</w:t>
+            </w:r>
+          </w:p>
+        </w:tc>
+        <w:tc>
+          <w:tcPr>
+            <w:tcW w:type="dxa" w:w="1728"/>
+          </w:tcPr>
+          <w:p>
+            <w:r>
+              <w:t>企业级目标阈值</w:t>
+            </w:r>
+          </w:p>
+        </w:tc>
+        <w:tc>
+          <w:tcPr>
+            <w:tcW w:type="dxa" w:w="1728"/>
+          </w:tcPr>
+          <w:p>
+            <w:r>
+              <w:t>适用场景</w:t>
             </w:r>
           </w:p>
         </w:tc>
@@ -1689,127 +1605,59 @@
       <w:tr>
         <w:tc>
           <w:tcPr>
-            <w:tcW w:w="1560" w:type="dxa"/>
-            <w:tcMar>
-              <w:top w:type="dxa" w:w="60"/>
-              <w:left w:type="dxa" w:w="120"/>
-              <w:bottom w:type="dxa" w:w="30"/>
-              <w:right w:type="dxa" w:w="120"/>
-            </w:tcMar>
-          </w:tcPr>
-          <w:p>
-            <w:pPr>
-              <w:spacing w:before="120" w:after="120" w:line="288" w:lineRule="auto"/>
-              <w:ind w:left="0"/>
-              <w:jc w:val="left"/>
-            </w:pPr>
-            <w:r>
-              <w:rPr>
-                <w:rFonts w:eastAsia="等线" w:ascii="Arial" w:cs="Arial" w:hAnsi="Arial"/>
-                <w:sz w:val="22"/>
-              </w:rPr>
-              <w:t>准确性</w:t>
-            </w:r>
-          </w:p>
-        </w:tc>
-        <w:tc>
-          <w:tcPr>
-            <w:tcW w:w="1680" w:type="dxa"/>
-            <w:tcMar>
-              <w:top w:type="dxa" w:w="60"/>
-              <w:left w:type="dxa" w:w="120"/>
-              <w:bottom w:type="dxa" w:w="30"/>
-              <w:right w:type="dxa" w:w="120"/>
-            </w:tcMar>
-          </w:tcPr>
-          <w:p>
-            <w:pPr>
-              <w:spacing w:before="120" w:after="120" w:line="288" w:lineRule="auto"/>
-              <w:ind w:left="0"/>
-              <w:jc w:val="left"/>
-            </w:pPr>
-            <w:r>
-              <w:rPr>
-                <w:rFonts w:eastAsia="等线" w:ascii="Arial" w:cs="Arial" w:hAnsi="Arial"/>
-                <w:sz w:val="22"/>
-              </w:rPr>
-              <w:t>回复的对不对</w:t>
-            </w:r>
-          </w:p>
-        </w:tc>
-        <w:tc>
-          <w:tcPr>
-            <w:tcW w:w="1680" w:type="dxa"/>
-            <w:tcMar>
-              <w:top w:type="dxa" w:w="60"/>
-              <w:left w:type="dxa" w:w="120"/>
-              <w:bottom w:type="dxa" w:w="30"/>
-              <w:right w:type="dxa" w:w="120"/>
-            </w:tcMar>
-          </w:tcPr>
-          <w:p>
-            <w:pPr>
-              <w:spacing w:before="120" w:after="120" w:line="288" w:lineRule="auto"/>
-              <w:ind w:left="0"/>
-              <w:jc w:val="left"/>
-            </w:pPr>
-            <w:r>
-              <w:rPr>
-                <w:rFonts w:eastAsia="等线" w:ascii="Arial" w:cs="Arial" w:hAnsi="Arial"/>
-                <w:sz w:val="22"/>
-              </w:rPr>
-              <w:t>每条问题1-5分专家平均分</w:t>
-            </w:r>
-          </w:p>
-        </w:tc>
-        <w:tc>
-          <w:tcPr>
-            <w:tcW w:w="1680" w:type="dxa"/>
-            <w:tcMar>
-              <w:top w:type="dxa" w:w="60"/>
-              <w:left w:type="dxa" w:w="120"/>
-              <w:bottom w:type="dxa" w:w="30"/>
-              <w:right w:type="dxa" w:w="120"/>
-            </w:tcMar>
-          </w:tcPr>
-          <w:p>
-            <w:pPr>
-              <w:spacing w:before="120" w:after="120" w:line="288" w:lineRule="auto"/>
-              <w:ind w:left="0"/>
-              <w:jc w:val="left"/>
-            </w:pPr>
-            <w:r>
-              <w:rPr>
-                <w:rFonts w:eastAsia="等线" w:ascii="Arial" w:cs="Arial" w:hAnsi="Arial"/>
-                <w:sz w:val="22"/>
-                <w:shd w:fill="f76964"/>
-              </w:rPr>
-              <w:t>平均≥4.5分</w:t>
-            </w:r>
-          </w:p>
-        </w:tc>
-        <w:tc>
-          <w:tcPr>
-            <w:tcW w:w="1680" w:type="dxa"/>
-            <w:tcMar>
-              <w:top w:type="dxa" w:w="60"/>
-              <w:left w:type="dxa" w:w="120"/>
-              <w:bottom w:type="dxa" w:w="30"/>
-              <w:right w:type="dxa" w:w="120"/>
-            </w:tcMar>
-          </w:tcPr>
-          <w:p>
-            <w:pPr>
-              <w:spacing w:before="120" w:after="120" w:line="288" w:lineRule="auto"/>
-              <w:ind w:left="0"/>
-              <w:jc w:val="left"/>
-            </w:pPr>
-            <w:r>
-              <w:rPr>
-                <w:rFonts w:eastAsia="等线" w:ascii="Arial" w:cs="Arial" w:hAnsi="Arial"/>
-                <w:sz w:val="22"/>
-              </w:rPr>
-              <w:t>开放 + 非开放</w:t>
+            <w:tcW w:type="dxa" w:w="1728"/>
+          </w:tcPr>
+          <w:p>
+            <w:r>
+              <w:t>多维准确性</w:t>
+              <w:br/>
+              <w:t>(Multidimensional Accuracy)</w:t>
+            </w:r>
+          </w:p>
+        </w:tc>
+        <w:tc>
+          <w:tcPr>
+            <w:tcW w:type="dxa" w:w="1728"/>
+          </w:tcPr>
+          <w:p>
+            <w:r>
+              <w:t>事实与逻辑双重校验。确保数据检索不漏、业务计算不错、逻辑推演不偏。</w:t>
+            </w:r>
+          </w:p>
+        </w:tc>
+        <w:tc>
+          <w:tcPr>
+            <w:tcW w:type="dxa" w:w="1728"/>
+          </w:tcPr>
+          <w:p>
+            <w:r>
+              <w:t>非开放题：自动化精准比对匹配度</w:t>
+              <w:br/>
+              <w:t>开放题：LLM 裁判 1-5 分量化矩阵 (事实/洞察/建议)</w:t>
+            </w:r>
+          </w:p>
+        </w:tc>
+        <w:tc>
+          <w:tcPr>
+            <w:tcW w:type="dxa" w:w="1728"/>
+          </w:tcPr>
+          <w:p>
+            <w:r>
+              <w:t>非开放题：100%</w:t>
+              <w:br/>
+              <w:t>开放题：平均分 ≥ 4.5</w:t>
+            </w:r>
+          </w:p>
+        </w:tc>
+        <w:tc>
+          <w:tcPr>
+            <w:tcW w:type="dxa" w:w="1728"/>
+          </w:tcPr>
+          <w:p>
+            <w:r>
+              <w:t>全量题库</w:t>
+              <w:br/>
+              <w:t>(非开放 + 开放)</w:t>
             </w:r>
           </w:p>
         </w:tc>
@@ -1817,157 +1665,115 @@
       <w:tr>
         <w:tc>
           <w:tcPr>
-            <w:tcW w:w="1560" w:type="dxa"/>
-            <w:tcMar>
-              <w:top w:type="dxa" w:w="60"/>
-              <w:left w:type="dxa" w:w="120"/>
-              <w:bottom w:type="dxa" w:w="30"/>
-              <w:right w:type="dxa" w:w="120"/>
-            </w:tcMar>
-          </w:tcPr>
-          <w:p>
-            <w:pPr>
-              <w:spacing w:before="120" w:after="120" w:line="288" w:lineRule="auto"/>
-              <w:ind w:left="0"/>
-              <w:jc w:val="left"/>
-            </w:pPr>
-            <w:r>
-              <w:rPr>
-                <w:rFonts w:eastAsia="等线" w:ascii="Arial" w:cs="Arial" w:hAnsi="Arial"/>
-                <w:sz w:val="22"/>
-              </w:rPr>
-              <w:t>一致性</w:t>
-            </w:r>
-          </w:p>
-        </w:tc>
-        <w:tc>
-          <w:tcPr>
-            <w:tcW w:w="1680" w:type="dxa"/>
-            <w:tcMar>
-              <w:top w:type="dxa" w:w="60"/>
-              <w:left w:type="dxa" w:w="120"/>
-              <w:bottom w:type="dxa" w:w="30"/>
-              <w:right w:type="dxa" w:w="120"/>
-            </w:tcMar>
-          </w:tcPr>
-          <w:p>
-            <w:pPr>
-              <w:spacing w:before="120" w:after="120" w:line="288" w:lineRule="auto"/>
-              <w:ind w:left="0"/>
-              <w:jc w:val="left"/>
-            </w:pPr>
-            <w:r>
-              <w:rPr>
-                <w:rFonts w:eastAsia="等线" w:ascii="Arial" w:cs="Arial" w:hAnsi="Arial"/>
-                <w:sz w:val="22"/>
-              </w:rPr>
-              <w:t>相同问题多次运行输出相同</w:t>
-            </w:r>
-          </w:p>
-        </w:tc>
-        <w:tc>
-          <w:tcPr>
-            <w:tcW w:w="1680" w:type="dxa"/>
-            <w:tcMar>
-              <w:top w:type="dxa" w:w="60"/>
-              <w:left w:type="dxa" w:w="120"/>
-              <w:bottom w:type="dxa" w:w="30"/>
-              <w:right w:type="dxa" w:w="120"/>
-            </w:tcMar>
-          </w:tcPr>
-          <w:p>
-            <w:pPr>
-              <w:spacing w:before="120" w:after="120" w:line="288" w:lineRule="auto"/>
-              <w:ind w:left="0"/>
-              <w:jc w:val="left"/>
-            </w:pPr>
-            <w:r>
-              <w:rPr>
-                <w:rFonts w:eastAsia="等线" w:ascii="Arial" w:cs="Arial" w:hAnsi="Arial"/>
-                <w:sz w:val="22"/>
-              </w:rPr>
-              <w:t>20次运行零差异率</w:t>
-            </w:r>
-          </w:p>
-        </w:tc>
-        <w:tc>
-          <w:tcPr>
-            <w:tcW w:w="1680" w:type="dxa"/>
-            <w:tcMar>
-              <w:top w:type="dxa" w:w="60"/>
-              <w:left w:type="dxa" w:w="120"/>
-              <w:bottom w:type="dxa" w:w="30"/>
-              <w:right w:type="dxa" w:w="120"/>
-            </w:tcMar>
-          </w:tcPr>
-          <w:p>
-            <w:pPr>
-              <w:spacing w:before="120" w:after="120" w:line="288" w:lineRule="auto"/>
-              <w:ind w:left="0"/>
-              <w:jc w:val="left"/>
-            </w:pPr>
-            <w:r>
-              <w:rPr>
-                <w:rFonts w:eastAsia="等线" w:ascii="Arial" w:cs="Arial" w:hAnsi="Arial"/>
-                <w:sz w:val="22"/>
-                <w:shd w:fill="f76964"/>
-              </w:rPr>
-              <w:t>100%</w:t>
-            </w:r>
-          </w:p>
-        </w:tc>
-        <w:tc>
-          <w:tcPr>
-            <w:tcW w:w="1680" w:type="dxa"/>
-            <w:tcMar>
-              <w:top w:type="dxa" w:w="60"/>
-              <w:left w:type="dxa" w:w="120"/>
-              <w:bottom w:type="dxa" w:w="30"/>
-              <w:right w:type="dxa" w:w="120"/>
-            </w:tcMar>
-          </w:tcPr>
-          <w:p>
-            <w:pPr>
-              <w:spacing w:before="120" w:after="120" w:line="288" w:lineRule="auto"/>
-              <w:ind w:left="0"/>
-              <w:jc w:val="left"/>
-            </w:pPr>
-            <w:r>
-              <w:rPr>
-                <w:rFonts w:eastAsia="等线" w:ascii="Arial" w:cs="Arial" w:hAnsi="Arial"/>
-                <w:sz w:val="22"/>
-              </w:rPr>
-              <w:t>两者均适用</w:t>
+            <w:tcW w:type="dxa" w:w="1728"/>
+          </w:tcPr>
+          <w:p>
+            <w:r>
+              <w:t>一致性与鲁棒性</w:t>
+              <w:br/>
+              <w:t>(Consistency &amp; Robustness)</w:t>
+            </w:r>
+          </w:p>
+        </w:tc>
+        <w:tc>
+          <w:tcPr>
+            <w:tcW w:type="dxa" w:w="1728"/>
+          </w:tcPr>
+          <w:p>
+            <w:r>
+              <w:t>面对相同的高阶经营提问或存在微小扰动的 Prompt 时，系统能否提供绝对稳定的解答输出。</w:t>
+            </w:r>
+          </w:p>
+        </w:tc>
+        <w:tc>
+          <w:tcPr>
+            <w:tcW w:type="dxa" w:w="1728"/>
+          </w:tcPr>
+          <w:p>
+            <w:r>
+              <w:t>高并发压力测试下，对同一问题抽样 20 次并计算输出结果的零差异比率。</w:t>
+            </w:r>
+          </w:p>
+        </w:tc>
+        <w:tc>
+          <w:tcPr>
+            <w:tcW w:type="dxa" w:w="1728"/>
+          </w:tcPr>
+          <w:p>
+            <w:r>
+              <w:t>100% 零差异率</w:t>
+            </w:r>
+          </w:p>
+        </w:tc>
+        <w:tc>
+          <w:tcPr>
+            <w:tcW w:type="dxa" w:w="1728"/>
+          </w:tcPr>
+          <w:p>
+            <w:r>
+              <w:t>重点针对大额合同与高危商机类的严谨查询</w:t>
+            </w:r>
+          </w:p>
+        </w:tc>
+      </w:tr>
+      <w:tr>
+        <w:tc>
+          <w:tcPr>
+            <w:tcW w:type="dxa" w:w="1728"/>
+          </w:tcPr>
+          <w:p>
+            <w:r>
+              <w:t>零幻觉溯源率</w:t>
+              <w:br/>
+              <w:t>(Zero-Hallucination)</w:t>
+            </w:r>
+          </w:p>
+        </w:tc>
+        <w:tc>
+          <w:tcPr>
+            <w:tcW w:type="dxa" w:w="1728"/>
+          </w:tcPr>
+          <w:p>
+            <w:r>
+              <w:t>输出文本中引用的任意具体数值、阶段名称或最终用户实体，必须 100% 拥有底层测试数据集的引用依据凭证。严防模型脑补。</w:t>
+            </w:r>
+          </w:p>
+        </w:tc>
+        <w:tc>
+          <w:tcPr>
+            <w:tcW w:type="dxa" w:w="1728"/>
+          </w:tcPr>
+          <w:p>
+            <w:r>
+              <w:t>实体链接穿透率计算：由 LLM 裁判提取数值/实体，并交由脚本与源库比对，计算捏造实体个数。</w:t>
+            </w:r>
+          </w:p>
+        </w:tc>
+        <w:tc>
+          <w:tcPr>
+            <w:tcW w:type="dxa" w:w="1728"/>
+          </w:tcPr>
+          <w:p>
+            <w:r>
+              <w:t>绝对 0 幻觉</w:t>
+              <w:br/>
+              <w:t>(容忍度 0%)</w:t>
+            </w:r>
+          </w:p>
+        </w:tc>
+        <w:tc>
+          <w:tcPr>
+            <w:tcW w:type="dxa" w:w="1728"/>
+          </w:tcPr>
+          <w:p>
+            <w:r>
+              <w:t>全量开放问题深度分析段落</w:t>
             </w:r>
           </w:p>
         </w:tc>
       </w:tr>
     </w:tbl>
-    <w:p>
-      <w:pPr>
-        <w:numPr>
-          <w:numId w:val="18"/>
-        </w:numPr>
-        <w:spacing w:before="120" w:after="120" w:line="288" w:lineRule="auto"/>
-        <w:ind w:left="0"/>
-        <w:jc w:val="left"/>
-      </w:pPr>
-      <w:r>
-        <w:rPr>
-          <w:rFonts w:eastAsia="等线" w:ascii="Arial" w:cs="Arial" w:hAnsi="Arial"/>
-          <w:b w:val="true"/>
-          <w:sz w:val="22"/>
-        </w:rPr>
-        <w:t>综合通过</w:t>
-      </w:r>
-      <w:r>
-        <w:rPr>
-          <w:rFonts w:eastAsia="等线" w:ascii="Arial" w:cs="Arial" w:hAnsi="Arial"/>
-          <w:sz w:val="22"/>
-        </w:rPr>
-        <w:t>：准确性≥4.5分 + 一致性100% 。</w:t>
-      </w:r>
-    </w:p>
+    <w:p/>
     <w:p>
       <w:pPr/>
       <w:r>

</xml_diff>

<commit_message>
update: extremely optimize the test scope section in docx
Made-with: Cursor
</commit_message>
<xml_diff>
--- a/test_plan/经分智能体测试方案2.0.docx
+++ b/test_plan/经分智能体测试方案2.0.docx
@@ -114,6 +114,45 @@
       </w:r>
     </w:p>
     <w:p>
+      <w:r>
+        <w:rPr>
+          <w:b/>
+        </w:rPr>
+        <w:t>1. 评测输入源 (Input Vectors)：</w:t>
+      </w:r>
+    </w:p>
+    <w:p>
+      <w:r>
+        <w:t>依托真实的业务系统快照构建动态测试集（测试数据.xlsx），提取出包含 80 道高拟真度复合型经营问题的全量题库，实现对基础事实提取与高阶商业逻辑推演的双重压测。</w:t>
+      </w:r>
+    </w:p>
+    <w:p>
+      <w:r>
+        <w:rPr>
+          <w:b/>
+        </w:rPr>
+        <w:t>2. 触发与交互方式 (Execution Modality)：</w:t>
+      </w:r>
+    </w:p>
+    <w:p>
+      <w:r>
+        <w:t>摒弃传统的人工点选，全面采用 RPA (Robotic Process Automation) 引擎直接挂载智能体的前端 UI。通过自动注入问题集并实时监听抓取流式响应结果，实现闭环全异步跑批。</w:t>
+      </w:r>
+    </w:p>
+    <w:p>
+      <w:r>
+        <w:rPr>
+          <w:b/>
+        </w:rPr>
+        <w:t>3. 评测维度分类 (Taxonomy of Queries)：</w:t>
+      </w:r>
+    </w:p>
+    <w:p>
+      <w:r>
+        <w:t>为全面摸底大模型的能力边界，将测试题库解耦为“确定性事实”与“主观性推演”两大阵列：</w:t>
+      </w:r>
+    </w:p>
+    <w:p>
       <w:pPr>
         <w:pStyle w:val="4"/>
         <w:spacing w:before="260" w:after="120" w:line="288" w:lineRule="auto"/>
@@ -121,105 +160,8 @@
         <w:jc w:val="left"/>
         <w:outlineLvl w:val="3"/>
       </w:pPr>
-      <w:bookmarkStart w:name="heading_2" w:id="2"/>
-      <w:r>
-        <w:rPr>
-          <w:rFonts w:eastAsia="等线" w:ascii="Arial" w:cs="Arial" w:hAnsi="Arial"/>
-          <w:b w:val="true"/>
-          <w:sz w:val="28"/>
-        </w:rPr>
-        <w:t>二. 测试范围</w:t>
-      </w:r>
-      <w:bookmarkEnd w:id="2"/>
-    </w:p>
-    <w:p>
-      <w:pPr>
-        <w:numPr>
-          <w:numId w:val="3"/>
-        </w:numPr>
-        <w:spacing w:before="120" w:after="120" w:line="288" w:lineRule="auto"/>
-        <w:ind w:left="0"/>
-        <w:jc w:val="left"/>
-      </w:pPr>
-      <w:r>
-        <w:rPr>
-          <w:rFonts w:eastAsia="等线" w:ascii="Arial" w:cs="Arial" w:hAnsi="Arial"/>
-          <w:b w:val="true"/>
-          <w:sz w:val="22"/>
-        </w:rPr>
-        <w:t>输入</w:t>
-      </w:r>
-      <w:r>
-        <w:rPr>
-          <w:rFonts w:eastAsia="等线" w:ascii="Arial" w:cs="Arial" w:hAnsi="Arial"/>
-          <w:sz w:val="22"/>
-        </w:rPr>
-        <w:t>：构造问题集（</w:t>
-      </w:r>
-      <w:r>
-        <w:rPr>
-          <w:rFonts w:eastAsia="等线" w:ascii="Arial" w:cs="Arial" w:hAnsi="Arial"/>
-          <w:sz w:val="22"/>
-          <w:shd w:fill="fff67a"/>
-        </w:rPr>
-        <w:t>80-100个</w:t>
-      </w:r>
-      <w:r>
-        <w:rPr>
-          <w:rFonts w:eastAsia="等线" w:ascii="Arial" w:cs="Arial" w:hAnsi="Arial"/>
-          <w:sz w:val="22"/>
-        </w:rPr>
-        <w:t>）。</w:t>
-      </w:r>
-    </w:p>
-    <w:p>
-      <w:pPr>
-        <w:numPr>
-          <w:numId w:val="4"/>
-        </w:numPr>
-        <w:spacing w:before="120" w:after="120" w:line="288" w:lineRule="auto"/>
-        <w:ind w:left="0"/>
-        <w:jc w:val="left"/>
-      </w:pPr>
-      <w:r>
-        <w:rPr>
-          <w:rFonts w:eastAsia="等线" w:ascii="Arial" w:cs="Arial" w:hAnsi="Arial"/>
-          <w:b w:val="true"/>
-          <w:sz w:val="22"/>
-        </w:rPr>
-        <w:t>方式</w:t>
-      </w:r>
-      <w:r>
-        <w:rPr>
-          <w:rFonts w:eastAsia="等线" w:ascii="Arial" w:cs="Arial" w:hAnsi="Arial"/>
-          <w:sz w:val="22"/>
-        </w:rPr>
-        <w:t>：通过大模型对话接口输入问题，记录回复。</w:t>
-      </w:r>
-    </w:p>
-    <w:p>
-      <w:pPr>
-        <w:numPr>
-          <w:numId w:val="5"/>
-        </w:numPr>
-        <w:spacing w:before="120" w:after="120" w:line="288" w:lineRule="auto"/>
-        <w:ind w:left="0"/>
-        <w:jc w:val="left"/>
-      </w:pPr>
-      <w:r>
-        <w:rPr>
-          <w:rFonts w:eastAsia="等线" w:ascii="Arial" w:cs="Arial" w:hAnsi="Arial"/>
-          <w:b w:val="true"/>
-          <w:sz w:val="22"/>
-        </w:rPr>
-        <w:t>问题分类</w:t>
-      </w:r>
-      <w:r>
-        <w:rPr>
-          <w:rFonts w:eastAsia="等线" w:ascii="Arial" w:cs="Arial" w:hAnsi="Arial"/>
-          <w:sz w:val="22"/>
-        </w:rPr>
-        <w:t>（两大类）：</w:t>
+      <w:r>
+        <w:t>二. 测试范围与边界定界 (Test Scope &amp; Boundaries)</w:t>
       </w:r>
     </w:p>
     <w:tbl>
@@ -254,17 +196,8 @@
             </w:tcMar>
           </w:tcPr>
           <w:p>
-            <w:pPr>
-              <w:spacing w:before="120" w:after="120" w:line="288" w:lineRule="auto"/>
-              <w:ind w:left="0"/>
-              <w:jc w:val="left"/>
-            </w:pPr>
-            <w:r>
-              <w:rPr>
-                <w:rFonts w:eastAsia="等线" w:ascii="Arial" w:cs="Arial" w:hAnsi="Arial"/>
-                <w:sz w:val="22"/>
-              </w:rPr>
-              <w:t>类型</w:t>
+            <w:r>
+              <w:t>问题阵列</w:t>
             </w:r>
           </w:p>
         </w:tc>
@@ -279,17 +212,8 @@
             </w:tcMar>
           </w:tcPr>
           <w:p>
-            <w:pPr>
-              <w:spacing w:before="120" w:after="120" w:line="288" w:lineRule="auto"/>
-              <w:ind w:left="0"/>
-              <w:jc w:val="left"/>
-            </w:pPr>
-            <w:r>
-              <w:rPr>
-                <w:rFonts w:eastAsia="等线" w:ascii="Arial" w:cs="Arial" w:hAnsi="Arial"/>
-                <w:sz w:val="22"/>
-              </w:rPr>
-              <w:t>定义与示例</w:t>
+            <w:r>
+              <w:t>能力定义与指令范式</w:t>
             </w:r>
           </w:p>
         </w:tc>
@@ -304,17 +228,8 @@
             </w:tcMar>
           </w:tcPr>
           <w:p>
-            <w:pPr>
-              <w:spacing w:before="120" w:after="120" w:line="288" w:lineRule="auto"/>
-              <w:ind w:left="0"/>
-              <w:jc w:val="left"/>
-            </w:pPr>
-            <w:r>
-              <w:rPr>
-                <w:rFonts w:eastAsia="等线" w:ascii="Arial" w:cs="Arial" w:hAnsi="Arial"/>
-                <w:sz w:val="22"/>
-              </w:rPr>
-              <w:t>数量建议</w:t>
+            <w:r>
+              <w:t>题库配比</w:t>
             </w:r>
           </w:p>
         </w:tc>
@@ -329,17 +244,8 @@
             </w:tcMar>
           </w:tcPr>
           <w:p>
-            <w:pPr>
-              <w:spacing w:before="120" w:after="120" w:line="288" w:lineRule="auto"/>
-              <w:ind w:left="0"/>
-              <w:jc w:val="left"/>
-            </w:pPr>
-            <w:r>
-              <w:rPr>
-                <w:rFonts w:eastAsia="等线" w:ascii="Arial" w:cs="Arial" w:hAnsi="Arial"/>
-                <w:sz w:val="22"/>
-              </w:rPr>
-              <w:t>判断重点</w:t>
+            <w:r>
+              <w:t>核心锚点</w:t>
             </w:r>
           </w:p>
         </w:tc>
@@ -356,25 +262,11 @@
             </w:tcMar>
           </w:tcPr>
           <w:p>
-            <w:pPr>
-              <w:spacing w:before="120" w:after="120" w:line="288" w:lineRule="auto"/>
-              <w:ind w:left="0"/>
-              <w:jc w:val="left"/>
-            </w:pPr>
-            <w:r>
-              <w:rPr>
-                <w:rFonts w:eastAsia="等线" w:ascii="Arial" w:cs="Arial" w:hAnsi="Arial"/>
-                <w:sz w:val="22"/>
-              </w:rPr>
+            <w:r>
               <w:t>非开放问题</w:t>
-            </w:r>
-          </w:p>
-          <w:p>
-            <w:pPr>
-              <w:spacing w:before="120" w:after="120" w:line="288" w:lineRule="auto"/>
-              <w:ind w:left="0"/>
-              <w:jc w:val="left"/>
-            </w:pPr>
+              <w:br/>
+              <w:t>(Fact-Based)</w:t>
+            </w:r>
           </w:p>
         </w:tc>
         <w:tc>
@@ -388,32 +280,10 @@
             </w:tcMar>
           </w:tcPr>
           <w:p>
-            <w:pPr>
-              <w:spacing w:before="120" w:after="120" w:line="288" w:lineRule="auto"/>
-              <w:ind w:left="0"/>
-              <w:jc w:val="left"/>
-            </w:pPr>
-            <w:r>
-              <w:rPr>
-                <w:rFonts w:eastAsia="等线" w:ascii="Arial" w:cs="Arial" w:hAnsi="Arial"/>
-                <w:sz w:val="22"/>
-              </w:rPr>
-              <w:t>客观事实查询，有明确标准答案（</w:t>
-            </w:r>
-            <w:r>
-              <w:rPr>
-                <w:rFonts w:eastAsia="等线" w:ascii="Arial" w:cs="Arial" w:hAnsi="Arial"/>
-                <w:sz w:val="22"/>
-                <w:shd w:fill="fff67a"/>
-              </w:rPr>
-              <w:t>数值/列表</w:t>
-            </w:r>
-            <w:r>
-              <w:rPr>
-                <w:rFonts w:eastAsia="等线" w:ascii="Arial" w:cs="Arial" w:hAnsi="Arial"/>
-                <w:sz w:val="22"/>
-              </w:rPr>
-              <w:t>）。示例：“当前商机储备总额是多少？”“高风险商机Top3有哪些？”</w:t>
+            <w:r>
+              <w:t>客观事实检索，具备绝对唯一的 Ground Truth。</w:t>
+              <w:br/>
+              <w:t>示例：“净利率最高的合同是哪一个？”</w:t>
             </w:r>
           </w:p>
         </w:tc>
@@ -428,25 +298,11 @@
             </w:tcMar>
           </w:tcPr>
           <w:p>
-            <w:pPr>
-              <w:spacing w:before="120" w:after="120" w:line="288" w:lineRule="auto"/>
-              <w:ind w:left="0"/>
-              <w:jc w:val="left"/>
-            </w:pPr>
-            <w:r>
-              <w:rPr>
-                <w:rFonts w:eastAsia="等线" w:ascii="Arial" w:cs="Arial" w:hAnsi="Arial"/>
-                <w:sz w:val="22"/>
-              </w:rPr>
-              <w:t>50-60个</w:t>
-            </w:r>
-          </w:p>
-          <w:p>
-            <w:pPr>
-              <w:spacing w:before="120" w:after="120" w:line="288" w:lineRule="auto"/>
-              <w:ind w:left="0"/>
-              <w:jc w:val="left"/>
-            </w:pPr>
+            <w:r>
+              <w:t>50 道</w:t>
+              <w:br/>
+              <w:t>(高阶逻辑)</w:t>
+            </w:r>
           </w:p>
         </w:tc>
         <w:tc>
@@ -460,25 +316,9 @@
             </w:tcMar>
           </w:tcPr>
           <w:p>
-            <w:pPr>
-              <w:spacing w:before="120" w:after="120" w:line="288" w:lineRule="auto"/>
-              <w:ind w:left="0"/>
-              <w:jc w:val="left"/>
-            </w:pPr>
-            <w:r>
-              <w:rPr>
-                <w:rFonts w:eastAsia="等线" w:ascii="Arial" w:cs="Arial" w:hAnsi="Arial"/>
-                <w:sz w:val="22"/>
-              </w:rPr>
-              <w:t>准确性（事实匹配）</w:t>
-            </w:r>
-          </w:p>
-          <w:p>
-            <w:pPr>
-              <w:spacing w:before="120" w:after="120" w:line="288" w:lineRule="auto"/>
-              <w:ind w:left="0"/>
-              <w:jc w:val="left"/>
-            </w:pPr>
+            <w:r>
+              <w:t>数据提取精准度、跨表聚合能力</w:t>
+            </w:r>
           </w:p>
         </w:tc>
       </w:tr>
@@ -494,25 +334,11 @@
             </w:tcMar>
           </w:tcPr>
           <w:p>
-            <w:pPr>
-              <w:spacing w:before="120" w:after="120" w:line="288" w:lineRule="auto"/>
-              <w:ind w:left="0"/>
-              <w:jc w:val="left"/>
-            </w:pPr>
-            <w:r>
-              <w:rPr>
-                <w:rFonts w:eastAsia="等线" w:ascii="Arial" w:cs="Arial" w:hAnsi="Arial"/>
-                <w:sz w:val="22"/>
-              </w:rPr>
+            <w:r>
               <w:t>开放问题</w:t>
-            </w:r>
-          </w:p>
-          <w:p>
-            <w:pPr>
-              <w:spacing w:before="120" w:after="120" w:line="288" w:lineRule="auto"/>
-              <w:ind w:left="0"/>
-              <w:jc w:val="left"/>
-            </w:pPr>
+              <w:br/>
+              <w:t>(Insight-Based)</w:t>
+            </w:r>
           </w:p>
         </w:tc>
         <w:tc>
@@ -526,17 +352,10 @@
             </w:tcMar>
           </w:tcPr>
           <w:p>
-            <w:pPr>
-              <w:spacing w:before="120" w:after="120" w:line="288" w:lineRule="auto"/>
-              <w:ind w:left="0"/>
-              <w:jc w:val="left"/>
-            </w:pPr>
-            <w:r>
-              <w:rPr>
-                <w:rFonts w:eastAsia="等线" w:ascii="Arial" w:cs="Arial" w:hAnsi="Arial"/>
-                <w:sz w:val="22"/>
-              </w:rPr>
-              <w:t>主观分析/根因/建议，需要推理。示例：“为什么商机缺口大？”“给出高风险商机缓解建议。”</w:t>
+            <w:r>
+              <w:t>主观归纳与经营诊断，需提供三段式推理引擎输出。</w:t>
+              <w:br/>
+              <w:t>示例：“为什么杨帆利润这么低？请给出管理对策。”</w:t>
             </w:r>
           </w:p>
         </w:tc>
@@ -551,25 +370,11 @@
             </w:tcMar>
           </w:tcPr>
           <w:p>
-            <w:pPr>
-              <w:spacing w:before="120" w:after="120" w:line="288" w:lineRule="auto"/>
-              <w:ind w:left="0"/>
-              <w:jc w:val="left"/>
-            </w:pPr>
-            <w:r>
-              <w:rPr>
-                <w:rFonts w:eastAsia="等线" w:ascii="Arial" w:cs="Arial" w:hAnsi="Arial"/>
-                <w:sz w:val="22"/>
-              </w:rPr>
-              <w:t>30-40个</w:t>
-            </w:r>
-          </w:p>
-          <w:p>
-            <w:pPr>
-              <w:spacing w:before="120" w:after="120" w:line="288" w:lineRule="auto"/>
-              <w:ind w:left="0"/>
-              <w:jc w:val="left"/>
-            </w:pPr>
+            <w:r>
+              <w:t>30 道</w:t>
+              <w:br/>
+              <w:t>(灵魂拷问)</w:t>
+            </w:r>
           </w:p>
         </w:tc>
         <w:tc>
@@ -583,25 +388,9 @@
             </w:tcMar>
           </w:tcPr>
           <w:p>
-            <w:pPr>
-              <w:spacing w:before="120" w:after="120" w:line="288" w:lineRule="auto"/>
-              <w:ind w:left="0"/>
-              <w:jc w:val="left"/>
-            </w:pPr>
-            <w:r>
-              <w:rPr>
-                <w:rFonts w:eastAsia="等线" w:ascii="Arial" w:cs="Arial" w:hAnsi="Arial"/>
-                <w:sz w:val="22"/>
-              </w:rPr>
-              <w:t>准确性（事实准 + 逻辑严 + 建议可行）</w:t>
-            </w:r>
-          </w:p>
-          <w:p>
-            <w:pPr>
-              <w:spacing w:before="120" w:after="120" w:line="288" w:lineRule="auto"/>
-              <w:ind w:left="0"/>
-              <w:jc w:val="left"/>
-            </w:pPr>
+            <w:r>
+              <w:t>事实零幻觉、商业逻辑严密性、对策可行性</w:t>
+            </w:r>
           </w:p>
         </w:tc>
       </w:tr>

</xml_diff>

<commit_message>
fix: restore missing section 2 content in docx
Made-with: Cursor
</commit_message>
<xml_diff>
--- a/test_plan/经分智能体测试方案2.0.docx
+++ b/test_plan/经分智能体测试方案2.0.docx
@@ -164,6 +164,188 @@
         <w:t>二. 测试范围与边界定界 (Test Scope &amp; Boundaries)</w:t>
       </w:r>
     </w:p>
+    <w:p>
+      <w:r>
+        <w:t>• 输入数据源：构造高度拟真的高阶业务问题集（共 80 题），数据底座基于脱敏的真实系统报表（商机表、合同表、项目表等）。</w:t>
+      </w:r>
+    </w:p>
+    <w:p>
+      <w:r>
+        <w:t>• 执行方式：通过 RPA（Robotic Process Automation）自动化脚本驱动 Edge 浏览器，在系统内网对话框中进行无人值守的批量问题注入与回答抓取，并将回复内容秒级落盘。</w:t>
+      </w:r>
+    </w:p>
+    <w:p>
+      <w:r>
+        <w:t>• 问题分类与校验维度：</w:t>
+      </w:r>
+    </w:p>
+    <w:tbl>
+      <w:tblPr>
+        <w:tblW w:type="auto" w:w="0"/>
+        <w:tblLook w:firstColumn="1" w:firstRow="1" w:lastColumn="0" w:lastRow="0" w:noHBand="0" w:noVBand="1" w:val="04A0"/>
+        <w:tblBorders>
+          <w:top w:val="single" w:sz="4" w:space="0" w:color="000000"/>
+          <w:left w:val="single" w:sz="4" w:space="0" w:color="000000"/>
+          <w:bottom w:val="single" w:sz="4" w:space="0" w:color="000000"/>
+          <w:right w:val="single" w:sz="4" w:space="0" w:color="000000"/>
+          <w:insideH w:val="single" w:sz="4" w:space="0" w:color="000000"/>
+          <w:insideV w:val="single" w:sz="4" w:space="0" w:color="000000"/>
+        </w:tblBorders>
+      </w:tblPr>
+      <w:tblGrid>
+        <w:gridCol w:w="2256"/>
+        <w:gridCol w:w="2256"/>
+        <w:gridCol w:w="2256"/>
+        <w:gridCol w:w="2256"/>
+      </w:tblGrid>
+      <w:tr>
+        <w:tc>
+          <w:tcPr>
+            <w:tcW w:type="dxa" w:w="2256"/>
+          </w:tcPr>
+          <w:p>
+            <w:r>
+              <w:rPr>
+                <w:b/>
+              </w:rPr>
+              <w:t>问题类型</w:t>
+            </w:r>
+          </w:p>
+        </w:tc>
+        <w:tc>
+          <w:tcPr>
+            <w:tcW w:type="dxa" w:w="2256"/>
+          </w:tcPr>
+          <w:p>
+            <w:r>
+              <w:rPr>
+                <w:b/>
+              </w:rPr>
+              <w:t>题型定义与特性</w:t>
+            </w:r>
+          </w:p>
+        </w:tc>
+        <w:tc>
+          <w:tcPr>
+            <w:tcW w:type="dxa" w:w="2256"/>
+          </w:tcPr>
+          <w:p>
+            <w:r>
+              <w:rPr>
+                <w:b/>
+              </w:rPr>
+              <w:t>数量分布</w:t>
+            </w:r>
+          </w:p>
+        </w:tc>
+        <w:tc>
+          <w:tcPr>
+            <w:tcW w:type="dxa" w:w="2256"/>
+          </w:tcPr>
+          <w:p>
+            <w:r>
+              <w:rPr>
+                <w:b/>
+              </w:rPr>
+              <w:t>核心评判标准与验证逻辑</w:t>
+            </w:r>
+          </w:p>
+        </w:tc>
+      </w:tr>
+      <w:tr>
+        <w:tc>
+          <w:tcPr>
+            <w:tcW w:type="dxa" w:w="2256"/>
+          </w:tcPr>
+          <w:p>
+            <w:r>
+              <w:t>非开放问题</w:t>
+              <w:br/>
+              <w:t>（硬逻辑校验）</w:t>
+            </w:r>
+          </w:p>
+        </w:tc>
+        <w:tc>
+          <w:tcPr>
+            <w:tcW w:type="dxa" w:w="2256"/>
+          </w:tcPr>
+          <w:p>
+            <w:r>
+              <w:t>客观事实查询、跨表统计、极值聚合。有绝对唯一的数值或明确的枚举列表答案。</w:t>
+            </w:r>
+          </w:p>
+        </w:tc>
+        <w:tc>
+          <w:tcPr>
+            <w:tcW w:type="dxa" w:w="2256"/>
+          </w:tcPr>
+          <w:p>
+            <w:r>
+              <w:t>50 题</w:t>
+            </w:r>
+          </w:p>
+        </w:tc>
+        <w:tc>
+          <w:tcPr>
+            <w:tcW w:type="dxa" w:w="2256"/>
+          </w:tcPr>
+          <w:p>
+            <w:r>
+              <w:t>事实级精准度 (Accuracy)。</w:t>
+              <w:br/>
+              <w:t>利用 Python 脚本正则匹配提取核心数值或特定实体，与 Ground Truth 进行 100% 强等值比对。</w:t>
+            </w:r>
+          </w:p>
+        </w:tc>
+      </w:tr>
+      <w:tr>
+        <w:tc>
+          <w:tcPr>
+            <w:tcW w:type="dxa" w:w="2256"/>
+          </w:tcPr>
+          <w:p>
+            <w:r>
+              <w:t>开放问题</w:t>
+              <w:br/>
+              <w:t>（高维主观校验）</w:t>
+            </w:r>
+          </w:p>
+        </w:tc>
+        <w:tc>
+          <w:tcPr>
+            <w:tcW w:type="dxa" w:w="2256"/>
+          </w:tcPr>
+          <w:p>
+            <w:r>
+              <w:t>面向经营管理层的宏观主观分析、流失归因推演与高阶策略建议。</w:t>
+            </w:r>
+          </w:p>
+        </w:tc>
+        <w:tc>
+          <w:tcPr>
+            <w:tcW w:type="dxa" w:w="2256"/>
+          </w:tcPr>
+          <w:p>
+            <w:r>
+              <w:t>30 题</w:t>
+            </w:r>
+          </w:p>
+        </w:tc>
+        <w:tc>
+          <w:tcPr>
+            <w:tcW w:type="dxa" w:w="2256"/>
+          </w:tcPr>
+          <w:p>
+            <w:r>
+              <w:t>逻辑与建议可行性 (Insight &amp; Action)。</w:t>
+              <w:br/>
+              <w:t>引入 LLM 裁判，依据“事实匹配、深度分析、建议有效性”三大维度进行结构化评分。</w:t>
+            </w:r>
+          </w:p>
+        </w:tc>
+      </w:tr>
+    </w:tbl>
+    <w:p/>
     <w:p>
       <w:pPr>
         <w:pStyle w:val="4"/>

</xml_diff>

<commit_message>
docs: add detailed 1-5 point scoring rubrics for non-open and open questions
Made-with: Cursor
</commit_message>
<xml_diff>
--- a/test_plan/经分智能体测试方案2.0.docx
+++ b/test_plan/经分智能体测试方案2.0.docx
@@ -407,7 +407,37 @@
         <w:jc w:val="left"/>
       </w:pPr>
       <w:r>
-        <w:t>• 执行方法：自动化脚本对比智能体的文本输出，精准核对数字大小、排名顺序及名单是否匹配，完全匹配则得满分（5分），残缺或错误自动扣分，彻底杜绝主观偏差。</w:t>
+        <w:t>• 执行方法：自动化脚本提取智能体回复的核心数值或实体名单，与 Ground Truth 进行精准比对。</w:t>
+      </w:r>
+    </w:p>
+    <w:p>
+      <w:r>
+        <w:t>• 1-5 分量化打分标准：</w:t>
+      </w:r>
+    </w:p>
+    <w:p>
+      <w:r>
+        <w:t xml:space="preserve">  - 5 分：核心数值/名单完全匹配，无多余错误信息。</w:t>
+      </w:r>
+    </w:p>
+    <w:p>
+      <w:r>
+        <w:t xml:space="preserve">  - 4 分：核心结论正确，但存在冗余的非关键错误信息或轻微单位格式瑕疵。</w:t>
+      </w:r>
+    </w:p>
+    <w:p>
+      <w:r>
+        <w:t xml:space="preserve">  - 3 分：列表型问题命中大部分（如 Top3 对了 2 个），或数值误差在极小可接受范围内。</w:t>
+      </w:r>
+    </w:p>
+    <w:p>
+      <w:r>
+        <w:t xml:space="preserve">  - 2 分：核心数据错误，但命中了部分相关实体，答非所问但大方向在相关领域。</w:t>
+      </w:r>
+    </w:p>
+    <w:p>
+      <w:r>
+        <w:t xml:space="preserve">  - 1 分：完全错误或产生严重幻觉（凭空捏造数据/名单）。</w:t>
       </w:r>
     </w:p>
     <w:p>
@@ -451,18 +481,14 @@
         <w:ind w:left="907"/>
         <w:jc w:val="left"/>
       </w:pPr>
-      <w:r>
-        <w:t>忽略智能体回答的表面排版格式，纯粹穿透底层语义，考察其是否涵盖三大核心考核点：</w:t>
-      </w:r>
+      <w:r/>
     </w:p>
     <w:p>
       <w:pPr>
         <w:spacing w:before="120" w:after="120" w:line="288" w:lineRule="auto"/>
         <w:ind w:left="907"/>
       </w:pPr>
-      <w:r>
-        <w:t>• 事实与数据层（40%权重，满分2分）：是否精准找对底层数据，严防任何虚构或数据混用（幻觉）。</w:t>
-      </w:r>
+      <w:r/>
     </w:p>
     <w:p>
       <w:pPr>
@@ -470,9 +496,7 @@
         <w:ind w:left="907"/>
         <w:jc w:val="center"/>
       </w:pPr>
-      <w:r>
-        <w:t>• 归纳与分析层（30%权重，满分1.5分）：是否将冷冰冰的数据转化为有业务深度的根因洞察。</w:t>
-      </w:r>
+      <w:r/>
     </w:p>
     <w:p>
       <w:pPr>
@@ -483,8 +507,113 @@
         <w:ind w:left="0"/>
         <w:jc w:val="left"/>
       </w:pPr>
-      <w:r>
-        <w:t>• 落地与建议层（30%权重，满分1.5分）：是否输出了具备实操性、针对性的经营管理对策。</w:t>
+      <w:r/>
+    </w:p>
+    <w:p>
+      <w:r>
+        <w:t>忽略排版格式，穿透底层语义，LLM 裁判会对以下三个维度分别进行 1-5 分的独立打分，最终按权重核算总分：</w:t>
+        <w:br/>
+      </w:r>
+    </w:p>
+    <w:p>
+      <w:r>
+        <w:rPr>
+          <w:b/>
+        </w:rPr>
+        <w:t>• 事实与数据层（40%权重，转化后满分2分）：</w:t>
+      </w:r>
+    </w:p>
+    <w:p>
+      <w:r>
+        <w:t xml:space="preserve">  - 5 分：精准提取所有关键业务数据和实体，无任何遗漏，与底层事实 100% 吻合。</w:t>
+      </w:r>
+    </w:p>
+    <w:p>
+      <w:r>
+        <w:t xml:space="preserve">  - 4 分：提取了大部分核心数据，次要数据轻微遗漏，但不影响整体事实准确性。</w:t>
+      </w:r>
+    </w:p>
+    <w:p>
+      <w:r>
+        <w:t xml:space="preserve">  - 3 分：存在部分关键数据缺失，或使用了模糊的定性描述而非精确数值。</w:t>
+      </w:r>
+    </w:p>
+    <w:p>
+      <w:r>
+        <w:t xml:space="preserve">  - 2 分：关键数据提取错误或遗漏严重，事实基础薄弱。</w:t>
+      </w:r>
+    </w:p>
+    <w:p>
+      <w:r>
+        <w:t xml:space="preserve">  - 1 分：完全没有引用数据，或出现严重的“数据幻觉”（凭空捏造数值和实体）。</w:t>
+        <w:br/>
+      </w:r>
+    </w:p>
+    <w:p>
+      <w:r>
+        <w:rPr>
+          <w:b/>
+        </w:rPr>
+        <w:t>• 归纳与分析层（30%权重，转化后满分1.5分）：</w:t>
+      </w:r>
+    </w:p>
+    <w:p>
+      <w:r>
+        <w:t xml:space="preserve">  - 5 分：洞察极其深刻，精准击中业务根因，逻辑推演严密且闭环。</w:t>
+      </w:r>
+    </w:p>
+    <w:p>
+      <w:r>
+        <w:t xml:space="preserve">  - 4 分：分析逻辑合理，指出主要问题，但深度略显不足，偏向现象总结。</w:t>
+      </w:r>
+    </w:p>
+    <w:p>
+      <w:r>
+        <w:t xml:space="preserve">  - 3 分：逻辑尚可，但分析较为模式化或套话，缺乏对特定数据的针对性解读。</w:t>
+      </w:r>
+    </w:p>
+    <w:p>
+      <w:r>
+        <w:t xml:space="preserve">  - 2 分：归因错误，逻辑混乱，或结论与前文事实数据相矛盾。</w:t>
+      </w:r>
+    </w:p>
+    <w:p>
+      <w:r>
+        <w:t xml:space="preserve">  - 1 分：毫无分析可言，仅重复数据，或完全答非所问。</w:t>
+        <w:br/>
+      </w:r>
+    </w:p>
+    <w:p>
+      <w:r>
+        <w:rPr>
+          <w:b/>
+        </w:rPr>
+        <w:t>• 落地与建议层（30%权重，转化后满分1.5分）：</w:t>
+      </w:r>
+    </w:p>
+    <w:p>
+      <w:r>
+        <w:t xml:space="preserve">  - 5 分：建议极具实操性、针对性，能直接转化为管理动作（有明确抓手或策略）。</w:t>
+      </w:r>
+    </w:p>
+    <w:p>
+      <w:r>
+        <w:t xml:space="preserve">  - 4 分：建议具备一定可行性，方向正确，但在具体落地细节上略显宽泛。</w:t>
+      </w:r>
+    </w:p>
+    <w:p>
+      <w:r>
+        <w:t xml:space="preserve">  - 3 分：建议属于行业“车轱辘话”（如“加强管理”），放之四海而皆准。</w:t>
+      </w:r>
+    </w:p>
+    <w:p>
+      <w:r>
+        <w:t xml:space="preserve">  - 2 分：建议不切实际，或完全无法在当前业务场景下落地。</w:t>
+      </w:r>
+    </w:p>
+    <w:p>
+      <w:r>
+        <w:t xml:space="preserve">  - 1 分：未给出任何建议，或给出的建议会对业务产生负面影响。</w:t>
       </w:r>
     </w:p>
     <w:p>

</xml_diff>

<commit_message>
docs: convert 1-5 point scoring rubrics into tables for better readability
Made-with: Cursor
</commit_message>
<xml_diff>
--- a/test_plan/经分智能体测试方案2.0.docx
+++ b/test_plan/经分智能体测试方案2.0.docx
@@ -415,31 +415,177 @@
         <w:t>• 1-5 分量化打分标准：</w:t>
       </w:r>
     </w:p>
-    <w:p>
-      <w:r>
-        <w:t xml:space="preserve">  - 5 分：核心数值/名单完全匹配，无多余错误信息。</w:t>
-      </w:r>
-    </w:p>
-    <w:p>
-      <w:r>
-        <w:t xml:space="preserve">  - 4 分：核心结论正确，但存在冗余的非关键错误信息或轻微单位格式瑕疵。</w:t>
-      </w:r>
-    </w:p>
-    <w:p>
-      <w:r>
-        <w:t xml:space="preserve">  - 3 分：列表型问题命中大部分（如 Top3 对了 2 个），或数值误差在极小可接受范围内。</w:t>
-      </w:r>
-    </w:p>
-    <w:p>
-      <w:r>
-        <w:t xml:space="preserve">  - 2 分：核心数据错误，但命中了部分相关实体，答非所问但大方向在相关领域。</w:t>
-      </w:r>
-    </w:p>
-    <w:p>
-      <w:r>
-        <w:t xml:space="preserve">  - 1 分：完全错误或产生严重幻觉（凭空捏造数据/名单）。</w:t>
-      </w:r>
-    </w:p>
+    <w:tbl>
+      <w:tblPr>
+        <w:tblW w:type="auto" w:w="0"/>
+        <w:tblLook w:firstColumn="1" w:firstRow="1" w:lastColumn="0" w:lastRow="0" w:noHBand="0" w:noVBand="1" w:val="04A0"/>
+        <w:tblBorders>
+          <w:top w:val="single" w:sz="4" w:space="0" w:color="000000"/>
+          <w:left w:val="single" w:sz="4" w:space="0" w:color="000000"/>
+          <w:bottom w:val="single" w:sz="4" w:space="0" w:color="000000"/>
+          <w:right w:val="single" w:sz="4" w:space="0" w:color="000000"/>
+          <w:insideH w:val="single" w:sz="4" w:space="0" w:color="000000"/>
+          <w:insideV w:val="single" w:sz="4" w:space="0" w:color="000000"/>
+        </w:tblBorders>
+      </w:tblPr>
+      <w:tblGrid>
+        <w:gridCol w:w="4512"/>
+        <w:gridCol w:w="4512"/>
+      </w:tblGrid>
+      <w:tr>
+        <w:tc>
+          <w:tcPr>
+            <w:tcW w:type="dxa" w:w="4512"/>
+          </w:tcPr>
+          <w:p>
+            <w:r>
+              <w:rPr>
+                <w:b/>
+              </w:rPr>
+              <w:t>分值</w:t>
+            </w:r>
+          </w:p>
+        </w:tc>
+        <w:tc>
+          <w:tcPr>
+            <w:tcW w:type="dxa" w:w="4512"/>
+          </w:tcPr>
+          <w:p>
+            <w:r>
+              <w:rPr>
+                <w:b/>
+              </w:rPr>
+              <w:t>打分标准</w:t>
+            </w:r>
+          </w:p>
+        </w:tc>
+      </w:tr>
+      <w:tr>
+        <w:tc>
+          <w:tcPr>
+            <w:tcW w:type="dxa" w:w="4512"/>
+          </w:tcPr>
+          <w:p>
+            <w:r>
+              <w:rPr>
+                <w:b/>
+              </w:rPr>
+              <w:t>5 分</w:t>
+            </w:r>
+          </w:p>
+        </w:tc>
+        <w:tc>
+          <w:tcPr>
+            <w:tcW w:type="dxa" w:w="4512"/>
+          </w:tcPr>
+          <w:p>
+            <w:r>
+              <w:t>核心数值/名单完全匹配，无多余错误信息。</w:t>
+            </w:r>
+          </w:p>
+        </w:tc>
+      </w:tr>
+      <w:tr>
+        <w:tc>
+          <w:tcPr>
+            <w:tcW w:type="dxa" w:w="4512"/>
+          </w:tcPr>
+          <w:p>
+            <w:r>
+              <w:rPr>
+                <w:b/>
+              </w:rPr>
+              <w:t>4 分</w:t>
+            </w:r>
+          </w:p>
+        </w:tc>
+        <w:tc>
+          <w:tcPr>
+            <w:tcW w:type="dxa" w:w="4512"/>
+          </w:tcPr>
+          <w:p>
+            <w:r>
+              <w:t>核心结论正确，但存在冗余的非关键错误信息或轻微单位格式瑕疵。</w:t>
+            </w:r>
+          </w:p>
+        </w:tc>
+      </w:tr>
+      <w:tr>
+        <w:tc>
+          <w:tcPr>
+            <w:tcW w:type="dxa" w:w="4512"/>
+          </w:tcPr>
+          <w:p>
+            <w:r>
+              <w:rPr>
+                <w:b/>
+              </w:rPr>
+              <w:t>3 分</w:t>
+            </w:r>
+          </w:p>
+        </w:tc>
+        <w:tc>
+          <w:tcPr>
+            <w:tcW w:type="dxa" w:w="4512"/>
+          </w:tcPr>
+          <w:p>
+            <w:r>
+              <w:t>列表型问题命中大部分（如 Top3 对了 2 个），或数值误差在极小可接受范围内。</w:t>
+            </w:r>
+          </w:p>
+        </w:tc>
+      </w:tr>
+      <w:tr>
+        <w:tc>
+          <w:tcPr>
+            <w:tcW w:type="dxa" w:w="4512"/>
+          </w:tcPr>
+          <w:p>
+            <w:r>
+              <w:rPr>
+                <w:b/>
+              </w:rPr>
+              <w:t>2 分</w:t>
+            </w:r>
+          </w:p>
+        </w:tc>
+        <w:tc>
+          <w:tcPr>
+            <w:tcW w:type="dxa" w:w="4512"/>
+          </w:tcPr>
+          <w:p>
+            <w:r>
+              <w:t>核心数据错误，但命中了部分相关实体，答非所问但大方向在相关领域。</w:t>
+            </w:r>
+          </w:p>
+        </w:tc>
+      </w:tr>
+      <w:tr>
+        <w:tc>
+          <w:tcPr>
+            <w:tcW w:type="dxa" w:w="4512"/>
+          </w:tcPr>
+          <w:p>
+            <w:r>
+              <w:rPr>
+                <w:b/>
+              </w:rPr>
+              <w:t>1 分</w:t>
+            </w:r>
+          </w:p>
+        </w:tc>
+        <w:tc>
+          <w:tcPr>
+            <w:tcW w:type="dxa" w:w="4512"/>
+          </w:tcPr>
+          <w:p>
+            <w:r>
+              <w:t>完全错误或产生严重幻觉（凭空捏造数据/名单）。</w:t>
+            </w:r>
+          </w:p>
+        </w:tc>
+      </w:tr>
+    </w:tbl>
     <w:p>
       <w:pPr>
         <w:numPr>
@@ -515,107 +661,309 @@
         <w:br/>
       </w:r>
     </w:p>
-    <w:p>
-      <w:r>
-        <w:rPr>
-          <w:b/>
-        </w:rPr>
-        <w:t>• 事实与数据层（40%权重，转化后满分2分）：</w:t>
-      </w:r>
-    </w:p>
-    <w:p>
-      <w:r>
-        <w:t xml:space="preserve">  - 5 分：精准提取所有关键业务数据和实体，无任何遗漏，与底层事实 100% 吻合。</w:t>
-      </w:r>
-    </w:p>
-    <w:p>
-      <w:r>
-        <w:t xml:space="preserve">  - 4 分：提取了大部分核心数据，次要数据轻微遗漏，但不影响整体事实准确性。</w:t>
-      </w:r>
-    </w:p>
-    <w:p>
-      <w:r>
-        <w:t xml:space="preserve">  - 3 分：存在部分关键数据缺失，或使用了模糊的定性描述而非精确数值。</w:t>
-      </w:r>
-    </w:p>
-    <w:p>
-      <w:r>
-        <w:t xml:space="preserve">  - 2 分：关键数据提取错误或遗漏严重，事实基础薄弱。</w:t>
-      </w:r>
-    </w:p>
-    <w:p>
-      <w:r>
-        <w:t xml:space="preserve">  - 1 分：完全没有引用数据，或出现严重的“数据幻觉”（凭空捏造数值和实体）。</w:t>
-        <w:br/>
-      </w:r>
-    </w:p>
-    <w:p>
-      <w:r>
-        <w:rPr>
-          <w:b/>
-        </w:rPr>
-        <w:t>• 归纳与分析层（30%权重，转化后满分1.5分）：</w:t>
-      </w:r>
-    </w:p>
-    <w:p>
-      <w:r>
-        <w:t xml:space="preserve">  - 5 分：洞察极其深刻，精准击中业务根因，逻辑推演严密且闭环。</w:t>
-      </w:r>
-    </w:p>
-    <w:p>
-      <w:r>
-        <w:t xml:space="preserve">  - 4 分：分析逻辑合理，指出主要问题，但深度略显不足，偏向现象总结。</w:t>
-      </w:r>
-    </w:p>
-    <w:p>
-      <w:r>
-        <w:t xml:space="preserve">  - 3 分：逻辑尚可，但分析较为模式化或套话，缺乏对特定数据的针对性解读。</w:t>
-      </w:r>
-    </w:p>
-    <w:p>
-      <w:r>
-        <w:t xml:space="preserve">  - 2 分：归因错误，逻辑混乱，或结论与前文事实数据相矛盾。</w:t>
-      </w:r>
-    </w:p>
-    <w:p>
-      <w:r>
-        <w:t xml:space="preserve">  - 1 分：毫无分析可言，仅重复数据，或完全答非所问。</w:t>
-        <w:br/>
-      </w:r>
-    </w:p>
-    <w:p>
-      <w:r>
-        <w:rPr>
-          <w:b/>
-        </w:rPr>
-        <w:t>• 落地与建议层（30%权重，转化后满分1.5分）：</w:t>
-      </w:r>
-    </w:p>
-    <w:p>
-      <w:r>
-        <w:t xml:space="preserve">  - 5 分：建议极具实操性、针对性，能直接转化为管理动作（有明确抓手或策略）。</w:t>
-      </w:r>
-    </w:p>
-    <w:p>
-      <w:r>
-        <w:t xml:space="preserve">  - 4 分：建议具备一定可行性，方向正确，但在具体落地细节上略显宽泛。</w:t>
-      </w:r>
-    </w:p>
-    <w:p>
-      <w:r>
-        <w:t xml:space="preserve">  - 3 分：建议属于行业“车轱辘话”（如“加强管理”），放之四海而皆准。</w:t>
-      </w:r>
-    </w:p>
-    <w:p>
-      <w:r>
-        <w:t xml:space="preserve">  - 2 分：建议不切实际，或完全无法在当前业务场景下落地。</w:t>
-      </w:r>
-    </w:p>
-    <w:p>
-      <w:r>
-        <w:t xml:space="preserve">  - 1 分：未给出任何建议，或给出的建议会对业务产生负面影响。</w:t>
-      </w:r>
-    </w:p>
+    <w:tbl>
+      <w:tblPr>
+        <w:tblW w:type="auto" w:w="0"/>
+        <w:tblLook w:firstColumn="1" w:firstRow="1" w:lastColumn="0" w:lastRow="0" w:noHBand="0" w:noVBand="1" w:val="04A0"/>
+        <w:tblBorders>
+          <w:top w:val="single" w:sz="4" w:space="0" w:color="000000"/>
+          <w:left w:val="single" w:sz="4" w:space="0" w:color="000000"/>
+          <w:bottom w:val="single" w:sz="4" w:space="0" w:color="000000"/>
+          <w:right w:val="single" w:sz="4" w:space="0" w:color="000000"/>
+          <w:insideH w:val="single" w:sz="4" w:space="0" w:color="000000"/>
+          <w:insideV w:val="single" w:sz="4" w:space="0" w:color="000000"/>
+        </w:tblBorders>
+      </w:tblPr>
+      <w:tblGrid>
+        <w:gridCol w:w="1504"/>
+        <w:gridCol w:w="1504"/>
+        <w:gridCol w:w="1504"/>
+        <w:gridCol w:w="1504"/>
+        <w:gridCol w:w="1504"/>
+        <w:gridCol w:w="1504"/>
+      </w:tblGrid>
+      <w:tr>
+        <w:tc>
+          <w:tcPr>
+            <w:tcW w:type="dxa" w:w="1504"/>
+          </w:tcPr>
+          <w:p>
+            <w:r>
+              <w:rPr>
+                <w:b/>
+              </w:rPr>
+              <w:t>评分维度</w:t>
+            </w:r>
+          </w:p>
+        </w:tc>
+        <w:tc>
+          <w:tcPr>
+            <w:tcW w:type="dxa" w:w="1504"/>
+          </w:tcPr>
+          <w:p>
+            <w:r>
+              <w:rPr>
+                <w:b/>
+              </w:rPr>
+              <w:t>5 分 (优秀)</w:t>
+            </w:r>
+          </w:p>
+        </w:tc>
+        <w:tc>
+          <w:tcPr>
+            <w:tcW w:type="dxa" w:w="1504"/>
+          </w:tcPr>
+          <w:p>
+            <w:r>
+              <w:rPr>
+                <w:b/>
+              </w:rPr>
+              <w:t>4 分 (良好)</w:t>
+            </w:r>
+          </w:p>
+        </w:tc>
+        <w:tc>
+          <w:tcPr>
+            <w:tcW w:type="dxa" w:w="1504"/>
+          </w:tcPr>
+          <w:p>
+            <w:r>
+              <w:rPr>
+                <w:b/>
+              </w:rPr>
+              <w:t>3 分 (及格)</w:t>
+            </w:r>
+          </w:p>
+        </w:tc>
+        <w:tc>
+          <w:tcPr>
+            <w:tcW w:type="dxa" w:w="1504"/>
+          </w:tcPr>
+          <w:p>
+            <w:r>
+              <w:rPr>
+                <w:b/>
+              </w:rPr>
+              <w:t>2 分 (较差)</w:t>
+            </w:r>
+          </w:p>
+        </w:tc>
+        <w:tc>
+          <w:tcPr>
+            <w:tcW w:type="dxa" w:w="1504"/>
+          </w:tcPr>
+          <w:p>
+            <w:r>
+              <w:rPr>
+                <w:b/>
+              </w:rPr>
+              <w:t>1 分 (极差)</w:t>
+            </w:r>
+          </w:p>
+        </w:tc>
+      </w:tr>
+      <w:tr>
+        <w:tc>
+          <w:tcPr>
+            <w:tcW w:type="dxa" w:w="1504"/>
+          </w:tcPr>
+          <w:p>
+            <w:r>
+              <w:rPr>
+                <w:b/>
+              </w:rPr>
+              <w:t>事实与数据层</w:t>
+              <w:br/>
+              <w:t>(40%权重)</w:t>
+            </w:r>
+          </w:p>
+        </w:tc>
+        <w:tc>
+          <w:tcPr>
+            <w:tcW w:type="dxa" w:w="1504"/>
+          </w:tcPr>
+          <w:p>
+            <w:r>
+              <w:t>精准提取所有关键业务数据和实体，无遗漏，与底层事实 100% 吻合。</w:t>
+            </w:r>
+          </w:p>
+        </w:tc>
+        <w:tc>
+          <w:tcPr>
+            <w:tcW w:type="dxa" w:w="1504"/>
+          </w:tcPr>
+          <w:p>
+            <w:r>
+              <w:t>提取大部分核心数据，次要数据轻微遗漏，不影响整体准确性。</w:t>
+            </w:r>
+          </w:p>
+        </w:tc>
+        <w:tc>
+          <w:tcPr>
+            <w:tcW w:type="dxa" w:w="1504"/>
+          </w:tcPr>
+          <w:p>
+            <w:r>
+              <w:t>存在部分关键数据缺失，或使用了模糊的定性描述而非精确数值。</w:t>
+            </w:r>
+          </w:p>
+        </w:tc>
+        <w:tc>
+          <w:tcPr>
+            <w:tcW w:type="dxa" w:w="1504"/>
+          </w:tcPr>
+          <w:p>
+            <w:r>
+              <w:t>关键数据提取错误或遗漏严重，事实基础薄弱。</w:t>
+            </w:r>
+          </w:p>
+        </w:tc>
+        <w:tc>
+          <w:tcPr>
+            <w:tcW w:type="dxa" w:w="1504"/>
+          </w:tcPr>
+          <w:p>
+            <w:r>
+              <w:t>完全没有引用数据，或出现严重的“数据幻觉”（凭空捏造）。</w:t>
+            </w:r>
+          </w:p>
+        </w:tc>
+      </w:tr>
+      <w:tr>
+        <w:tc>
+          <w:tcPr>
+            <w:tcW w:type="dxa" w:w="1504"/>
+          </w:tcPr>
+          <w:p>
+            <w:r>
+              <w:rPr>
+                <w:b/>
+              </w:rPr>
+              <w:t>归纳与分析层</w:t>
+              <w:br/>
+              <w:t>(30%权重)</w:t>
+            </w:r>
+          </w:p>
+        </w:tc>
+        <w:tc>
+          <w:tcPr>
+            <w:tcW w:type="dxa" w:w="1504"/>
+          </w:tcPr>
+          <w:p>
+            <w:r>
+              <w:t>洞察极其深刻，精准击中业务根因，逻辑推演严密且闭环。</w:t>
+            </w:r>
+          </w:p>
+        </w:tc>
+        <w:tc>
+          <w:tcPr>
+            <w:tcW w:type="dxa" w:w="1504"/>
+          </w:tcPr>
+          <w:p>
+            <w:r>
+              <w:t>分析逻辑合理，指出主要问题，但深度略显不足，偏向现象总结。</w:t>
+            </w:r>
+          </w:p>
+        </w:tc>
+        <w:tc>
+          <w:tcPr>
+            <w:tcW w:type="dxa" w:w="1504"/>
+          </w:tcPr>
+          <w:p>
+            <w:r>
+              <w:t>逻辑尚可，但分析较为模式化或套话，缺乏针对性解读。</w:t>
+            </w:r>
+          </w:p>
+        </w:tc>
+        <w:tc>
+          <w:tcPr>
+            <w:tcW w:type="dxa" w:w="1504"/>
+          </w:tcPr>
+          <w:p>
+            <w:r>
+              <w:t>归因错误，逻辑混乱，或结论与前文事实数据相矛盾。</w:t>
+            </w:r>
+          </w:p>
+        </w:tc>
+        <w:tc>
+          <w:tcPr>
+            <w:tcW w:type="dxa" w:w="1504"/>
+          </w:tcPr>
+          <w:p>
+            <w:r>
+              <w:t>毫无分析可言，仅重复数据，或完全答非所问。</w:t>
+            </w:r>
+          </w:p>
+        </w:tc>
+      </w:tr>
+      <w:tr>
+        <w:tc>
+          <w:tcPr>
+            <w:tcW w:type="dxa" w:w="1504"/>
+          </w:tcPr>
+          <w:p>
+            <w:r>
+              <w:rPr>
+                <w:b/>
+              </w:rPr>
+              <w:t>落地与建议层</w:t>
+              <w:br/>
+              <w:t>(30%权重)</w:t>
+            </w:r>
+          </w:p>
+        </w:tc>
+        <w:tc>
+          <w:tcPr>
+            <w:tcW w:type="dxa" w:w="1504"/>
+          </w:tcPr>
+          <w:p>
+            <w:r>
+              <w:t>建议极具实操性、针对性，能直接转化为管理动作（有明确抓手）。</w:t>
+            </w:r>
+          </w:p>
+        </w:tc>
+        <w:tc>
+          <w:tcPr>
+            <w:tcW w:type="dxa" w:w="1504"/>
+          </w:tcPr>
+          <w:p>
+            <w:r>
+              <w:t>建议具备一定可行性，方向正确，但在具体落地细节上略显宽泛。</w:t>
+            </w:r>
+          </w:p>
+        </w:tc>
+        <w:tc>
+          <w:tcPr>
+            <w:tcW w:type="dxa" w:w="1504"/>
+          </w:tcPr>
+          <w:p>
+            <w:r>
+              <w:t>建议属于行业“车轱辘话”（如“加强管理”），放之四海而皆准。</w:t>
+            </w:r>
+          </w:p>
+        </w:tc>
+        <w:tc>
+          <w:tcPr>
+            <w:tcW w:type="dxa" w:w="1504"/>
+          </w:tcPr>
+          <w:p>
+            <w:r>
+              <w:t>建议不切实际，或完全无法在当前业务场景下落地。</w:t>
+            </w:r>
+          </w:p>
+        </w:tc>
+        <w:tc>
+          <w:tcPr>
+            <w:tcW w:type="dxa" w:w="1504"/>
+          </w:tcPr>
+          <w:p>
+            <w:r>
+              <w:t>未给出任何建议，或给出的建议会对业务产生负面影响。</w:t>
+            </w:r>
+          </w:p>
+        </w:tc>
+      </w:tr>
+    </w:tbl>
     <w:p>
       <w:pPr>
         <w:numPr>

</xml_diff>

<commit_message>
docs: restructure example B scoring breakdown into a detailed 6-column table
Made-with: Cursor
</commit_message>
<xml_diff>
--- a/test_plan/经分智能体测试方案2.0.docx
+++ b/test_plan/经分智能体测试方案2.0.docx
@@ -1286,48 +1286,94 @@
         </w:tblBorders>
       </w:tblPr>
       <w:tblGrid>
-        <w:gridCol w:w="2256"/>
-        <w:gridCol w:w="2256"/>
-        <w:gridCol w:w="2256"/>
-        <w:gridCol w:w="2256"/>
+        <w:gridCol w:w="1504"/>
+        <w:gridCol w:w="1504"/>
+        <w:gridCol w:w="1504"/>
+        <w:gridCol w:w="1504"/>
+        <w:gridCol w:w="1504"/>
+        <w:gridCol w:w="1504"/>
       </w:tblGrid>
       <w:tr>
         <w:tc>
           <w:tcPr>
-            <w:tcW w:type="dxa" w:w="2256"/>
-          </w:tcPr>
-          <w:p>
-            <w:r>
-              <w:t>回复质量</w:t>
-            </w:r>
-          </w:p>
-        </w:tc>
-        <w:tc>
-          <w:tcPr>
-            <w:tcW w:type="dxa" w:w="2256"/>
-          </w:tcPr>
-          <w:p>
-            <w:r>
+            <w:tcW w:type="dxa" w:w="1504"/>
+          </w:tcPr>
+          <w:p>
+            <w:r>
+              <w:rPr>
+                <w:b/>
+              </w:rPr>
+              <w:t>评级</w:t>
+            </w:r>
+          </w:p>
+        </w:tc>
+        <w:tc>
+          <w:tcPr>
+            <w:tcW w:type="dxa" w:w="1504"/>
+          </w:tcPr>
+          <w:p>
+            <w:r>
+              <w:rPr>
+                <w:b/>
+              </w:rPr>
               <w:t>智能体回复示例</w:t>
             </w:r>
           </w:p>
         </w:tc>
         <w:tc>
           <w:tcPr>
-            <w:tcW w:type="dxa" w:w="2256"/>
-          </w:tcPr>
-          <w:p>
-            <w:r>
-              <w:t>LLM 裁判打分逻辑拆解</w:t>
-            </w:r>
-          </w:p>
-        </w:tc>
-        <w:tc>
-          <w:tcPr>
-            <w:tcW w:type="dxa" w:w="2256"/>
-          </w:tcPr>
-          <w:p>
-            <w:r>
+            <w:tcW w:type="dxa" w:w="1504"/>
+          </w:tcPr>
+          <w:p>
+            <w:r>
+              <w:rPr>
+                <w:b/>
+              </w:rPr>
+              <w:t>事实与数据层</w:t>
+              <w:br/>
+              <w:t>(满分2分)</w:t>
+            </w:r>
+          </w:p>
+        </w:tc>
+        <w:tc>
+          <w:tcPr>
+            <w:tcW w:type="dxa" w:w="1504"/>
+          </w:tcPr>
+          <w:p>
+            <w:r>
+              <w:rPr>
+                <w:b/>
+              </w:rPr>
+              <w:t>归纳与分析层</w:t>
+              <w:br/>
+              <w:t>(满分1.5分)</w:t>
+            </w:r>
+          </w:p>
+        </w:tc>
+        <w:tc>
+          <w:tcPr>
+            <w:tcW w:type="dxa" w:w="1504"/>
+          </w:tcPr>
+          <w:p>
+            <w:r>
+              <w:rPr>
+                <w:b/>
+              </w:rPr>
+              <w:t>落地与建议层</w:t>
+              <w:br/>
+              <w:t>(满分1.5分)</w:t>
+            </w:r>
+          </w:p>
+        </w:tc>
+        <w:tc>
+          <w:tcPr>
+            <w:tcW w:type="dxa" w:w="1504"/>
+          </w:tcPr>
+          <w:p>
+            <w:r>
+              <w:rPr>
+                <w:b/>
+              </w:rPr>
               <w:t>最终得分</w:t>
             </w:r>
           </w:p>
@@ -1336,17 +1382,17 @@
       <w:tr>
         <w:tc>
           <w:tcPr>
-            <w:tcW w:type="dxa" w:w="2256"/>
-          </w:tcPr>
-          <w:p>
-            <w:r>
-              <w:t>优秀</w:t>
-            </w:r>
-          </w:p>
-        </w:tc>
-        <w:tc>
-          <w:tcPr>
-            <w:tcW w:type="dxa" w:w="2256"/>
+            <w:tcW w:type="dxa" w:w="1504"/>
+          </w:tcPr>
+          <w:p>
+            <w:r>
+              <w:t>🟢 优秀</w:t>
+            </w:r>
+          </w:p>
+        </w:tc>
+        <w:tc>
+          <w:tcPr>
+            <w:tcW w:type="dxa" w:w="1504"/>
           </w:tcPr>
           <w:p>
             <w:r>
@@ -1356,24 +1402,58 @@
         </w:tc>
         <w:tc>
           <w:tcPr>
-            <w:tcW w:type="dxa" w:w="2256"/>
-          </w:tcPr>
-          <w:p>
-            <w:r>
-              <w:t>事实层(2分)：覆盖核心数据。</w:t>
+            <w:tcW w:type="dxa" w:w="1504"/>
+          </w:tcPr>
+          <w:p>
+            <w:r>
+              <w:rPr>
+                <w:b/>
+              </w:rPr>
+              <w:t>得 2 分</w:t>
               <w:br/>
-              <w:t>洞察层(1.5分)：指出延期与条款痛点。</w:t>
+              <w:t>覆盖核心数据。</w:t>
+            </w:r>
+          </w:p>
+        </w:tc>
+        <w:tc>
+          <w:tcPr>
+            <w:tcW w:type="dxa" w:w="1504"/>
+          </w:tcPr>
+          <w:p>
+            <w:r>
+              <w:rPr>
+                <w:b/>
+              </w:rPr>
+              <w:t>得 1.5 分</w:t>
               <w:br/>
-              <w:t>建议层(1.5分)：梯次报价与防延期追踪完全具备实操性。</w:t>
-            </w:r>
-          </w:p>
-        </w:tc>
-        <w:tc>
-          <w:tcPr>
-            <w:tcW w:type="dxa" w:w="2256"/>
-          </w:tcPr>
-          <w:p>
-            <w:r>
+              <w:t>精准指出延期与条款痛点。</w:t>
+            </w:r>
+          </w:p>
+        </w:tc>
+        <w:tc>
+          <w:tcPr>
+            <w:tcW w:type="dxa" w:w="1504"/>
+          </w:tcPr>
+          <w:p>
+            <w:r>
+              <w:rPr>
+                <w:b/>
+              </w:rPr>
+              <w:t>得 1.5 分</w:t>
+              <w:br/>
+              <w:t>梯次报价与防延期追踪完全具备实操性。</w:t>
+            </w:r>
+          </w:p>
+        </w:tc>
+        <w:tc>
+          <w:tcPr>
+            <w:tcW w:type="dxa" w:w="1504"/>
+          </w:tcPr>
+          <w:p>
+            <w:r>
+              <w:rPr>
+                <w:b/>
+              </w:rPr>
               <w:t>5 分</w:t>
             </w:r>
           </w:p>
@@ -1382,17 +1462,17 @@
       <w:tr>
         <w:tc>
           <w:tcPr>
-            <w:tcW w:type="dxa" w:w="2256"/>
-          </w:tcPr>
-          <w:p>
-            <w:r>
-              <w:t>不及格</w:t>
-            </w:r>
-          </w:p>
-        </w:tc>
-        <w:tc>
-          <w:tcPr>
-            <w:tcW w:type="dxa" w:w="2256"/>
+            <w:tcW w:type="dxa" w:w="1504"/>
+          </w:tcPr>
+          <w:p>
+            <w:r>
+              <w:t>🔴 不及格</w:t>
+            </w:r>
+          </w:p>
+        </w:tc>
+        <w:tc>
+          <w:tcPr>
+            <w:tcW w:type="dxa" w:w="1504"/>
           </w:tcPr>
           <w:p>
             <w:r>
@@ -1402,27 +1482,61 @@
         </w:tc>
         <w:tc>
           <w:tcPr>
-            <w:tcW w:type="dxa" w:w="2256"/>
-          </w:tcPr>
-          <w:p>
-            <w:r>
-              <w:t>事实层(0分)：完全缺失真实数据。</w:t>
+            <w:tcW w:type="dxa" w:w="1504"/>
+          </w:tcPr>
+          <w:p>
+            <w:r>
+              <w:rPr>
+                <w:b/>
+              </w:rPr>
+              <w:t>得 0 分</w:t>
               <w:br/>
-              <w:t>洞察层(0.5分)：归因流于表面。</w:t>
+              <w:t>完全缺失真实数据支撑。</w:t>
+            </w:r>
+          </w:p>
+        </w:tc>
+        <w:tc>
+          <w:tcPr>
+            <w:tcW w:type="dxa" w:w="1504"/>
+          </w:tcPr>
+          <w:p>
+            <w:r>
+              <w:rPr>
+                <w:b/>
+              </w:rPr>
+              <w:t>得 0.5 分</w:t>
               <w:br/>
-              <w:t>建议层(0.5分)：建议宽泛空洞，属无效车轱辘话。</w:t>
-            </w:r>
-          </w:p>
-        </w:tc>
-        <w:tc>
-          <w:tcPr>
-            <w:tcW w:type="dxa" w:w="2256"/>
-          </w:tcPr>
-          <w:p>
-            <w:r>
+              <w:t>归因流于表面，无视真实记录。</w:t>
+            </w:r>
+          </w:p>
+        </w:tc>
+        <w:tc>
+          <w:tcPr>
+            <w:tcW w:type="dxa" w:w="1504"/>
+          </w:tcPr>
+          <w:p>
+            <w:r>
+              <w:rPr>
+                <w:b/>
+              </w:rPr>
+              <w:t>得 0.5 分</w:t>
+              <w:br/>
+              <w:t>建议宽泛空洞，属车轱辘话。</w:t>
+            </w:r>
+          </w:p>
+        </w:tc>
+        <w:tc>
+          <w:tcPr>
+            <w:tcW w:type="dxa" w:w="1504"/>
+          </w:tcPr>
+          <w:p>
+            <w:r>
+              <w:rPr>
+                <w:b/>
+              </w:rPr>
               <w:t>1 分</w:t>
               <w:br/>
-              <w:t>(触发人工复检)</w:t>
+              <w:t>(人工复检)</w:t>
             </w:r>
           </w:p>
         </w:tc>

</xml_diff>